<commit_message>
added users.php with users table, and user entity CRUD buttons. Updated the dashboard to reflect users. Added register.php for admin to register users
</commit_message>
<xml_diff>
--- a/Week7/LOGBOOK/Log Book.docx
+++ b/Week7/LOGBOOK/Log Book.docx
@@ -5350,45 +5350,25 @@
                             <w:r>
                               <w:t xml:space="preserve">Figure </w:t>
                             </w:r>
-                            <w:r>
-                              <w:fldChar w:fldCharType="begin"/>
-                            </w:r>
-                            <w:r>
-                              <w:instrText xml:space="preserve"> STYLEREF 1 \s </w:instrText>
-                            </w:r>
-                            <w:r>
-                              <w:fldChar w:fldCharType="separate"/>
-                            </w:r>
-                            <w:r>
-                              <w:rPr>
-                                <w:noProof/>
-                              </w:rPr>
-                              <w:t>0</w:t>
-                            </w:r>
-                            <w:r>
-                              <w:fldChar w:fldCharType="end"/>
-                            </w:r>
+                            <w:fldSimple w:instr=" STYLEREF 1 \s ">
+                              <w:r>
+                                <w:rPr>
+                                  <w:noProof/>
+                                </w:rPr>
+                                <w:t>0</w:t>
+                              </w:r>
+                            </w:fldSimple>
                             <w:r>
                               <w:noBreakHyphen/>
                             </w:r>
-                            <w:r>
-                              <w:fldChar w:fldCharType="begin"/>
-                            </w:r>
-                            <w:r>
-                              <w:instrText xml:space="preserve"> SEQ Figure \* ARABIC \s 1 </w:instrText>
-                            </w:r>
-                            <w:r>
-                              <w:fldChar w:fldCharType="separate"/>
-                            </w:r>
-                            <w:r>
-                              <w:rPr>
-                                <w:noProof/>
-                              </w:rPr>
-                              <w:t>2</w:t>
-                            </w:r>
-                            <w:r>
-                              <w:fldChar w:fldCharType="end"/>
-                            </w:r>
+                            <w:fldSimple w:instr=" SEQ Figure \* ARABIC \s 1 ">
+                              <w:r>
+                                <w:rPr>
+                                  <w:noProof/>
+                                </w:rPr>
+                                <w:t>2</w:t>
+                              </w:r>
+                            </w:fldSimple>
                             <w:r>
                               <w:t>:Admin Dashboard</w:t>
                             </w:r>
@@ -5425,7 +5405,11 @@
           </mc:Choice>
           <mc:Fallback>
             <w:pict>
-              <v:shape w14:anchorId="61B4691D" id="Text Box 24" o:spid="_x0000_s1027" type="#_x0000_t202" style="position:absolute;margin-left:0;margin-top:110.2pt;width:329.25pt;height:18.4pt;z-index:251656704;visibility:visible;mso-wrap-style:square;mso-height-percent:0;mso-wrap-distance-left:9pt;mso-wrap-distance-top:0;mso-wrap-distance-right:9pt;mso-wrap-distance-bottom:0;mso-position-horizontal:left;mso-position-horizontal-relative:margin;mso-position-vertical:absolute;mso-position-vertical-relative:text;mso-height-percent:0;mso-height-relative:margin;v-text-anchor:top" o:gfxdata="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" stroked="f">
+              <v:shapetype w14:anchorId="61B4691D" id="_x0000_t202" coordsize="21600,21600" o:spt="202" path="m,l,21600r21600,l21600,xe">
+                <v:stroke joinstyle="miter"/>
+                <v:path gradientshapeok="t" o:connecttype="rect"/>
+              </v:shapetype>
+              <v:shape id="Text Box 24" o:spid="_x0000_s1027" type="#_x0000_t202" style="position:absolute;margin-left:0;margin-top:110.2pt;width:329.25pt;height:18.4pt;z-index:251656704;visibility:visible;mso-wrap-style:square;mso-height-percent:0;mso-wrap-distance-left:9pt;mso-wrap-distance-top:0;mso-wrap-distance-right:9pt;mso-wrap-distance-bottom:0;mso-position-horizontal:left;mso-position-horizontal-relative:margin;mso-position-vertical:absolute;mso-position-vertical-relative:text;mso-height-percent:0;mso-height-relative:margin;v-text-anchor:top" o:gfxdata="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" stroked="f">
                 <v:textbox inset="0,0,0,0">
                   <w:txbxContent>
                     <w:p>
@@ -5436,45 +5420,25 @@
                       <w:r>
                         <w:t xml:space="preserve">Figure </w:t>
                       </w:r>
-                      <w:r>
-                        <w:fldChar w:fldCharType="begin"/>
-                      </w:r>
-                      <w:r>
-                        <w:instrText xml:space="preserve"> STYLEREF 1 \s </w:instrText>
-                      </w:r>
-                      <w:r>
-                        <w:fldChar w:fldCharType="separate"/>
-                      </w:r>
-                      <w:r>
-                        <w:rPr>
-                          <w:noProof/>
-                        </w:rPr>
-                        <w:t>0</w:t>
-                      </w:r>
-                      <w:r>
-                        <w:fldChar w:fldCharType="end"/>
-                      </w:r>
+                      <w:fldSimple w:instr=" STYLEREF 1 \s ">
+                        <w:r>
+                          <w:rPr>
+                            <w:noProof/>
+                          </w:rPr>
+                          <w:t>0</w:t>
+                        </w:r>
+                      </w:fldSimple>
                       <w:r>
                         <w:noBreakHyphen/>
                       </w:r>
-                      <w:r>
-                        <w:fldChar w:fldCharType="begin"/>
-                      </w:r>
-                      <w:r>
-                        <w:instrText xml:space="preserve"> SEQ Figure \* ARABIC \s 1 </w:instrText>
-                      </w:r>
-                      <w:r>
-                        <w:fldChar w:fldCharType="separate"/>
-                      </w:r>
-                      <w:r>
-                        <w:rPr>
-                          <w:noProof/>
-                        </w:rPr>
-                        <w:t>2</w:t>
-                      </w:r>
-                      <w:r>
-                        <w:fldChar w:fldCharType="end"/>
-                      </w:r>
+                      <w:fldSimple w:instr=" SEQ Figure \* ARABIC \s 1 ">
+                        <w:r>
+                          <w:rPr>
+                            <w:noProof/>
+                          </w:rPr>
+                          <w:t>2</w:t>
+                        </w:r>
+                      </w:fldSimple>
                       <w:r>
                         <w:t>:Admin Dashboard</w:t>
                       </w:r>
@@ -9376,6 +9340,9 @@
         <w:keepNext/>
       </w:pPr>
       <w:r>
+        <w:rPr>
+          <w:noProof/>
+        </w:rPr>
         <w:drawing>
           <wp:inline distT="0" distB="0" distL="0" distR="0" wp14:anchorId="60AD650B" wp14:editId="5BA21D75">
             <wp:extent cx="5941823" cy="2562330"/>
@@ -9423,45 +9390,25 @@
       <w:r>
         <w:t xml:space="preserve">Figure </w:t>
       </w:r>
-      <w:r>
-        <w:fldChar w:fldCharType="begin"/>
-      </w:r>
-      <w:r>
-        <w:instrText xml:space="preserve"> STYLEREF 1 \s </w:instrText>
-      </w:r>
-      <w:r>
-        <w:fldChar w:fldCharType="separate"/>
-      </w:r>
-      <w:r>
-        <w:rPr>
-          <w:noProof/>
-        </w:rPr>
-        <w:t>0</w:t>
-      </w:r>
-      <w:r>
-        <w:fldChar w:fldCharType="end"/>
-      </w:r>
+      <w:fldSimple w:instr=" STYLEREF 1 \s ">
+        <w:r>
+          <w:rPr>
+            <w:noProof/>
+          </w:rPr>
+          <w:t>0</w:t>
+        </w:r>
+      </w:fldSimple>
       <w:r>
         <w:noBreakHyphen/>
       </w:r>
-      <w:r>
-        <w:fldChar w:fldCharType="begin"/>
-      </w:r>
-      <w:r>
-        <w:instrText xml:space="preserve"> SEQ Figure \* ARABIC \s 1 </w:instrText>
-      </w:r>
-      <w:r>
-        <w:fldChar w:fldCharType="separate"/>
-      </w:r>
-      <w:r>
-        <w:rPr>
-          <w:noProof/>
-        </w:rPr>
-        <w:t>2</w:t>
-      </w:r>
-      <w:r>
-        <w:fldChar w:fldCharType="end"/>
-      </w:r>
+      <w:fldSimple w:instr=" SEQ Figure \* ARABIC \s 1 ">
+        <w:r>
+          <w:rPr>
+            <w:noProof/>
+          </w:rPr>
+          <w:t>2</w:t>
+        </w:r>
+      </w:fldSimple>
       <w:r>
         <w:t>:SQL Script CREATE Books Table and Insert</w:t>
       </w:r>
@@ -9477,6 +9424,9 @@
         <w:keepNext/>
       </w:pPr>
       <w:r>
+        <w:rPr>
+          <w:noProof/>
+        </w:rPr>
         <w:lastRenderedPageBreak/>
         <w:drawing>
           <wp:inline distT="0" distB="0" distL="0" distR="0" wp14:anchorId="3EF98ED0" wp14:editId="0F4CA759">
@@ -9522,45 +9472,25 @@
       <w:r>
         <w:t xml:space="preserve">Figure </w:t>
       </w:r>
-      <w:r>
-        <w:fldChar w:fldCharType="begin"/>
-      </w:r>
-      <w:r>
-        <w:instrText xml:space="preserve"> STYLEREF 1 \s </w:instrText>
-      </w:r>
-      <w:r>
-        <w:fldChar w:fldCharType="separate"/>
-      </w:r>
-      <w:r>
-        <w:rPr>
-          <w:noProof/>
-        </w:rPr>
-        <w:t>0</w:t>
-      </w:r>
-      <w:r>
-        <w:fldChar w:fldCharType="end"/>
-      </w:r>
+      <w:fldSimple w:instr=" STYLEREF 1 \s ">
+        <w:r>
+          <w:rPr>
+            <w:noProof/>
+          </w:rPr>
+          <w:t>0</w:t>
+        </w:r>
+      </w:fldSimple>
       <w:r>
         <w:noBreakHyphen/>
       </w:r>
-      <w:r>
-        <w:fldChar w:fldCharType="begin"/>
-      </w:r>
-      <w:r>
-        <w:instrText xml:space="preserve"> SEQ Figure \* ARABIC \s 1 </w:instrText>
-      </w:r>
-      <w:r>
-        <w:fldChar w:fldCharType="separate"/>
-      </w:r>
-      <w:r>
-        <w:rPr>
-          <w:noProof/>
-        </w:rPr>
-        <w:t>3</w:t>
-      </w:r>
-      <w:r>
-        <w:fldChar w:fldCharType="end"/>
-      </w:r>
+      <w:fldSimple w:instr=" SEQ Figure \* ARABIC \s 1 ">
+        <w:r>
+          <w:rPr>
+            <w:noProof/>
+          </w:rPr>
+          <w:t>3</w:t>
+        </w:r>
+      </w:fldSimple>
       <w:r>
         <w:t>: Books Table with Sample book records</w:t>
       </w:r>
@@ -10030,6 +9960,9 @@
         <w:keepNext/>
       </w:pPr>
       <w:r>
+        <w:rPr>
+          <w:noProof/>
+        </w:rPr>
         <w:drawing>
           <wp:inline distT="0" distB="0" distL="0" distR="0" wp14:anchorId="0DE37E2C" wp14:editId="43A37905">
             <wp:extent cx="5943600" cy="914400"/>
@@ -10074,45 +10007,25 @@
       <w:r>
         <w:t xml:space="preserve">Figure </w:t>
       </w:r>
-      <w:r>
-        <w:fldChar w:fldCharType="begin"/>
-      </w:r>
-      <w:r>
-        <w:instrText xml:space="preserve"> STYLEREF 1 \s </w:instrText>
-      </w:r>
-      <w:r>
-        <w:fldChar w:fldCharType="separate"/>
-      </w:r>
-      <w:r>
-        <w:rPr>
-          <w:noProof/>
-        </w:rPr>
-        <w:t>0</w:t>
-      </w:r>
-      <w:r>
-        <w:fldChar w:fldCharType="end"/>
-      </w:r>
+      <w:fldSimple w:instr=" STYLEREF 1 \s ">
+        <w:r>
+          <w:rPr>
+            <w:noProof/>
+          </w:rPr>
+          <w:t>0</w:t>
+        </w:r>
+      </w:fldSimple>
       <w:r>
         <w:noBreakHyphen/>
       </w:r>
-      <w:r>
-        <w:fldChar w:fldCharType="begin"/>
-      </w:r>
-      <w:r>
-        <w:instrText xml:space="preserve"> SEQ Figure \* ARABIC \s 1 </w:instrText>
-      </w:r>
-      <w:r>
-        <w:fldChar w:fldCharType="separate"/>
-      </w:r>
-      <w:r>
-        <w:rPr>
-          <w:noProof/>
-        </w:rPr>
-        <w:t>7</w:t>
-      </w:r>
-      <w:r>
-        <w:fldChar w:fldCharType="end"/>
-      </w:r>
+      <w:fldSimple w:instr=" SEQ Figure \* ARABIC \s 1 ">
+        <w:r>
+          <w:rPr>
+            <w:noProof/>
+          </w:rPr>
+          <w:t>7</w:t>
+        </w:r>
+      </w:fldSimple>
       <w:r>
         <w:t>; Top Cards</w:t>
       </w:r>
@@ -10122,6 +10035,9 @@
         <w:keepNext/>
       </w:pPr>
       <w:r>
+        <w:rPr>
+          <w:noProof/>
+        </w:rPr>
         <w:lastRenderedPageBreak/>
         <w:drawing>
           <wp:inline distT="0" distB="0" distL="0" distR="0" wp14:anchorId="046C4AA7" wp14:editId="658AE831">
@@ -10167,45 +10083,25 @@
       <w:r>
         <w:t xml:space="preserve">Figure </w:t>
       </w:r>
-      <w:r>
-        <w:fldChar w:fldCharType="begin"/>
-      </w:r>
-      <w:r>
-        <w:instrText xml:space="preserve"> STYLEREF 1 \s </w:instrText>
-      </w:r>
-      <w:r>
-        <w:fldChar w:fldCharType="separate"/>
-      </w:r>
-      <w:r>
-        <w:rPr>
-          <w:noProof/>
-        </w:rPr>
-        <w:t>0</w:t>
-      </w:r>
-      <w:r>
-        <w:fldChar w:fldCharType="end"/>
-      </w:r>
+      <w:fldSimple w:instr=" STYLEREF 1 \s ">
+        <w:r>
+          <w:rPr>
+            <w:noProof/>
+          </w:rPr>
+          <w:t>0</w:t>
+        </w:r>
+      </w:fldSimple>
       <w:r>
         <w:noBreakHyphen/>
       </w:r>
-      <w:r>
-        <w:fldChar w:fldCharType="begin"/>
-      </w:r>
-      <w:r>
-        <w:instrText xml:space="preserve"> SEQ Figure \* ARABIC \s 1 </w:instrText>
-      </w:r>
-      <w:r>
-        <w:fldChar w:fldCharType="separate"/>
-      </w:r>
-      <w:r>
-        <w:rPr>
-          <w:noProof/>
-        </w:rPr>
-        <w:t>8</w:t>
-      </w:r>
-      <w:r>
-        <w:fldChar w:fldCharType="end"/>
-      </w:r>
+      <w:fldSimple w:instr=" SEQ Figure \* ARABIC \s 1 ">
+        <w:r>
+          <w:rPr>
+            <w:noProof/>
+          </w:rPr>
+          <w:t>8</w:t>
+        </w:r>
+      </w:fldSimple>
       <w:r>
         <w:t>:Edit Book records Form</w:t>
       </w:r>
@@ -10527,8 +10423,10 @@
       <w:pPr>
         <w:keepNext/>
       </w:pPr>
-      <w:bookmarkStart w:id="74" w:name="_GoBack"/>
-      <w:r>
+      <w:r>
+        <w:rPr>
+          <w:noProof/>
+        </w:rPr>
         <w:drawing>
           <wp:inline distT="0" distB="0" distL="0" distR="0" wp14:anchorId="78C3CBA7" wp14:editId="256AAAAE">
             <wp:extent cx="5943600" cy="557530"/>
@@ -10565,7 +10463,6 @@
           </wp:inline>
         </w:drawing>
       </w:r>
-      <w:bookmarkEnd w:id="74"/>
     </w:p>
     <w:p>
       <w:pPr>
@@ -10574,45 +10471,25 @@
       <w:r>
         <w:t xml:space="preserve">Figure </w:t>
       </w:r>
-      <w:r>
-        <w:fldChar w:fldCharType="begin"/>
-      </w:r>
-      <w:r>
-        <w:instrText xml:space="preserve"> STYLEREF 1 \s </w:instrText>
-      </w:r>
-      <w:r>
-        <w:fldChar w:fldCharType="separate"/>
-      </w:r>
-      <w:r>
-        <w:rPr>
-          <w:noProof/>
-        </w:rPr>
-        <w:t>0</w:t>
-      </w:r>
-      <w:r>
-        <w:fldChar w:fldCharType="end"/>
-      </w:r>
+      <w:fldSimple w:instr=" STYLEREF 1 \s ">
+        <w:r>
+          <w:rPr>
+            <w:noProof/>
+          </w:rPr>
+          <w:t>0</w:t>
+        </w:r>
+      </w:fldSimple>
       <w:r>
         <w:noBreakHyphen/>
       </w:r>
-      <w:r>
-        <w:fldChar w:fldCharType="begin"/>
-      </w:r>
-      <w:r>
-        <w:instrText xml:space="preserve"> SEQ Figure \* ARABIC \s 1 </w:instrText>
-      </w:r>
-      <w:r>
-        <w:fldChar w:fldCharType="separate"/>
-      </w:r>
-      <w:r>
-        <w:rPr>
-          <w:noProof/>
-        </w:rPr>
-        <w:t>11</w:t>
-      </w:r>
-      <w:r>
-        <w:fldChar w:fldCharType="end"/>
-      </w:r>
+      <w:fldSimple w:instr=" SEQ Figure \* ARABIC \s 1 ">
+        <w:r>
+          <w:rPr>
+            <w:noProof/>
+          </w:rPr>
+          <w:t>11</w:t>
+        </w:r>
+      </w:fldSimple>
       <w:r>
         <w:t>; Flash message showing Successful Update</w:t>
       </w:r>
@@ -10654,7 +10531,7 @@
           <w:u w:val="single"/>
         </w:rPr>
       </w:pPr>
-      <w:bookmarkStart w:id="75" w:name="_Toc232162148"/>
+      <w:bookmarkStart w:id="74" w:name="_Toc232162148"/>
       <w:r>
         <w:rPr>
           <w:rFonts w:ascii="Times New Roman" w:hAnsi="Times New Roman" w:cs="Times New Roman"/>
@@ -10664,7 +10541,7 @@
         </w:rPr>
         <w:t>REFLECTION</w:t>
       </w:r>
-      <w:bookmarkEnd w:id="75"/>
+      <w:bookmarkEnd w:id="74"/>
       <w:r>
         <w:rPr>
           <w:rFonts w:ascii="Times New Roman" w:hAnsi="Times New Roman" w:cs="Times New Roman"/>
@@ -10823,6 +10700,7 @@
         <w:t>Database Integration and CRUD Operations</w:t>
       </w:r>
     </w:p>
+    <w:p/>
     <w:p>
       <w:pPr>
         <w:keepNext/>
@@ -10836,6 +10714,7 @@
       <w:r>
         <w:rPr>
           <w:rFonts w:ascii="Times New Roman" w:hAnsi="Times New Roman" w:cs="Times New Roman"/>
+          <w:noProof/>
         </w:rPr>
         <w:drawing>
           <wp:inline distT="0" distB="0" distL="0" distR="0" wp14:anchorId="2FA2E70F" wp14:editId="051CA5D7">
@@ -10881,45 +10760,25 @@
       <w:r>
         <w:t xml:space="preserve">Figure </w:t>
       </w:r>
-      <w:r>
-        <w:fldChar w:fldCharType="begin"/>
-      </w:r>
-      <w:r>
-        <w:instrText xml:space="preserve"> STYLEREF 1 \s </w:instrText>
-      </w:r>
-      <w:r>
-        <w:fldChar w:fldCharType="separate"/>
-      </w:r>
-      <w:r>
-        <w:rPr>
-          <w:noProof/>
-        </w:rPr>
-        <w:t>0</w:t>
-      </w:r>
-      <w:r>
-        <w:fldChar w:fldCharType="end"/>
-      </w:r>
+      <w:fldSimple w:instr=" STYLEREF 1 \s ">
+        <w:r>
+          <w:rPr>
+            <w:noProof/>
+          </w:rPr>
+          <w:t>0</w:t>
+        </w:r>
+      </w:fldSimple>
       <w:r>
         <w:noBreakHyphen/>
       </w:r>
-      <w:r>
-        <w:fldChar w:fldCharType="begin"/>
-      </w:r>
-      <w:r>
-        <w:instrText xml:space="preserve"> SEQ Figure \* ARABIC \s 1 </w:instrText>
-      </w:r>
-      <w:r>
-        <w:fldChar w:fldCharType="separate"/>
-      </w:r>
-      <w:r>
-        <w:rPr>
-          <w:noProof/>
-        </w:rPr>
-        <w:t>1</w:t>
-      </w:r>
-      <w:r>
-        <w:fldChar w:fldCharType="end"/>
-      </w:r>
+      <w:fldSimple w:instr=" SEQ Figure \* ARABIC \s 1 ">
+        <w:r>
+          <w:rPr>
+            <w:noProof/>
+          </w:rPr>
+          <w:t>1</w:t>
+        </w:r>
+      </w:fldSimple>
       <w:r>
         <w:t>:Datab</w:t>
       </w:r>
@@ -10931,10 +10790,17 @@
       </w:r>
     </w:p>
     <w:p>
+      <w:bookmarkStart w:id="75" w:name="_GoBack"/>
+      <w:bookmarkEnd w:id="75"/>
+    </w:p>
+    <w:p>
       <w:pPr>
         <w:keepNext/>
       </w:pPr>
       <w:r>
+        <w:rPr>
+          <w:noProof/>
+        </w:rPr>
         <w:drawing>
           <wp:inline distT="0" distB="0" distL="0" distR="0" wp14:anchorId="1BC4B110" wp14:editId="01261CDB">
             <wp:extent cx="5943600" cy="1332230"/>
@@ -10979,45 +10845,25 @@
       <w:r>
         <w:t xml:space="preserve">Figure </w:t>
       </w:r>
-      <w:r>
-        <w:fldChar w:fldCharType="begin"/>
-      </w:r>
-      <w:r>
-        <w:instrText xml:space="preserve"> STYLEREF 1 \s </w:instrText>
-      </w:r>
-      <w:r>
-        <w:fldChar w:fldCharType="separate"/>
-      </w:r>
-      <w:r>
-        <w:rPr>
-          <w:noProof/>
-        </w:rPr>
-        <w:t>0</w:t>
-      </w:r>
-      <w:r>
-        <w:fldChar w:fldCharType="end"/>
-      </w:r>
+      <w:fldSimple w:instr=" STYLEREF 1 \s ">
+        <w:r>
+          <w:rPr>
+            <w:noProof/>
+          </w:rPr>
+          <w:t>0</w:t>
+        </w:r>
+      </w:fldSimple>
       <w:r>
         <w:noBreakHyphen/>
       </w:r>
-      <w:r>
-        <w:fldChar w:fldCharType="begin"/>
-      </w:r>
-      <w:r>
-        <w:instrText xml:space="preserve"> SEQ Figure \* ARABIC \s 1 </w:instrText>
-      </w:r>
-      <w:r>
-        <w:fldChar w:fldCharType="separate"/>
-      </w:r>
-      <w:r>
-        <w:rPr>
-          <w:noProof/>
-        </w:rPr>
-        <w:t>2</w:t>
-      </w:r>
-      <w:r>
-        <w:fldChar w:fldCharType="end"/>
-      </w:r>
+      <w:fldSimple w:instr=" SEQ Figure \* ARABIC \s 1 ">
+        <w:r>
+          <w:rPr>
+            <w:noProof/>
+          </w:rPr>
+          <w:t>2</w:t>
+        </w:r>
+      </w:fldSimple>
       <w:r>
         <w:t>: Connection script file inclusion</w:t>
       </w:r>
@@ -11029,43 +10875,9 @@
         </w:rPr>
       </w:pPr>
       <w:r>
-        <w:t>Modularization- Seperated the database connection into its own dedicated  file creating a Module that is pulled into t</w:t>
-      </w:r>
-      <w:r>
-        <w:t>he other pages(File Inclusion) u</w:t>
-      </w:r>
-      <w:r>
-        <w:t xml:space="preserve">sing the </w:t>
-      </w:r>
-      <w:r>
-        <w:rPr>
-          <w:i/>
-          <w:color w:val="FF0000"/>
-        </w:rPr>
-        <w:t>require_once__DIR__</w:t>
-      </w:r>
-      <w:r>
-        <w:rPr>
-          <w:color w:val="FF0000"/>
-        </w:rPr>
-        <w:t xml:space="preserve"> </w:t>
-      </w:r>
-      <w:r>
-        <w:rPr>
-          <w:color w:val="000000" w:themeColor="text1"/>
-        </w:rPr>
-        <w:t>method</w:t>
-      </w:r>
-    </w:p>
-    <w:p>
-      <w:pPr>
-        <w:rPr>
-          <w:color w:val="000000" w:themeColor="text1"/>
-        </w:rPr>
-      </w:pPr>
-      <w:r>
-        <w:rPr>
-          <w:rFonts w:ascii="Times New Roman" w:hAnsi="Times New Roman" w:cs="Times New Roman"/>
+        <w:rPr>
+          <w:rFonts w:ascii="Times New Roman" w:hAnsi="Times New Roman" w:cs="Times New Roman"/>
+          <w:noProof/>
         </w:rPr>
         <w:lastRenderedPageBreak/>
         <w:drawing>
@@ -11198,6 +11010,9 @@
         <w:keepNext/>
       </w:pPr>
       <w:r>
+        <w:rPr>
+          <w:noProof/>
+        </w:rPr>
         <w:drawing>
           <wp:inline distT="0" distB="0" distL="0" distR="0" wp14:anchorId="170D8FC6" wp14:editId="324BF971">
             <wp:extent cx="5943063" cy="3506875"/>
@@ -11242,45 +11057,25 @@
       <w:r>
         <w:t xml:space="preserve">Figure </w:t>
       </w:r>
-      <w:r>
-        <w:fldChar w:fldCharType="begin"/>
-      </w:r>
-      <w:r>
-        <w:instrText xml:space="preserve"> STYLEREF 1 \s </w:instrText>
-      </w:r>
-      <w:r>
-        <w:fldChar w:fldCharType="separate"/>
-      </w:r>
-      <w:r>
-        <w:rPr>
-          <w:noProof/>
-        </w:rPr>
-        <w:t>0</w:t>
-      </w:r>
-      <w:r>
-        <w:fldChar w:fldCharType="end"/>
-      </w:r>
+      <w:fldSimple w:instr=" STYLEREF 1 \s ">
+        <w:r>
+          <w:rPr>
+            <w:noProof/>
+          </w:rPr>
+          <w:t>0</w:t>
+        </w:r>
+      </w:fldSimple>
       <w:r>
         <w:noBreakHyphen/>
       </w:r>
-      <w:r>
-        <w:fldChar w:fldCharType="begin"/>
-      </w:r>
-      <w:r>
-        <w:instrText xml:space="preserve"> SEQ Figure \* ARABIC \s 1 </w:instrText>
-      </w:r>
-      <w:r>
-        <w:fldChar w:fldCharType="separate"/>
-      </w:r>
-      <w:r>
-        <w:rPr>
-          <w:noProof/>
-        </w:rPr>
-        <w:t>4</w:t>
-      </w:r>
-      <w:r>
-        <w:fldChar w:fldCharType="end"/>
-      </w:r>
+      <w:fldSimple w:instr=" SEQ Figure \* ARABIC \s 1 ">
+        <w:r>
+          <w:rPr>
+            <w:noProof/>
+          </w:rPr>
+          <w:t>4</w:t>
+        </w:r>
+      </w:fldSimple>
       <w:r>
         <w:t xml:space="preserve">;AddBook </w:t>
       </w:r>
@@ -11296,6 +11091,9 @@
         <w:keepNext/>
       </w:pPr>
       <w:r>
+        <w:rPr>
+          <w:noProof/>
+        </w:rPr>
         <w:lastRenderedPageBreak/>
         <w:drawing>
           <wp:inline distT="0" distB="0" distL="0" distR="0" wp14:anchorId="3F1E3492" wp14:editId="4921675D">
@@ -11341,45 +11139,25 @@
       <w:r>
         <w:t xml:space="preserve">Figure </w:t>
       </w:r>
-      <w:r>
-        <w:fldChar w:fldCharType="begin"/>
-      </w:r>
-      <w:r>
-        <w:instrText xml:space="preserve"> STYLEREF 1 \s </w:instrText>
-      </w:r>
-      <w:r>
-        <w:fldChar w:fldCharType="separate"/>
-      </w:r>
-      <w:r>
-        <w:rPr>
-          <w:noProof/>
-        </w:rPr>
-        <w:t>0</w:t>
-      </w:r>
-      <w:r>
-        <w:fldChar w:fldCharType="end"/>
-      </w:r>
+      <w:fldSimple w:instr=" STYLEREF 1 \s ">
+        <w:r>
+          <w:rPr>
+            <w:noProof/>
+          </w:rPr>
+          <w:t>0</w:t>
+        </w:r>
+      </w:fldSimple>
       <w:r>
         <w:noBreakHyphen/>
       </w:r>
-      <w:r>
-        <w:fldChar w:fldCharType="begin"/>
-      </w:r>
-      <w:r>
-        <w:instrText xml:space="preserve"> SEQ Figure \* ARABIC \s 1 </w:instrText>
-      </w:r>
-      <w:r>
-        <w:fldChar w:fldCharType="separate"/>
-      </w:r>
-      <w:r>
-        <w:rPr>
-          <w:noProof/>
-        </w:rPr>
-        <w:t>5</w:t>
-      </w:r>
-      <w:r>
-        <w:fldChar w:fldCharType="end"/>
-      </w:r>
+      <w:fldSimple w:instr=" SEQ Figure \* ARABIC \s 1 ">
+        <w:r>
+          <w:rPr>
+            <w:noProof/>
+          </w:rPr>
+          <w:t>5</w:t>
+        </w:r>
+      </w:fldSimple>
       <w:r>
         <w:t xml:space="preserve">; Error </w:t>
       </w:r>
@@ -11395,6 +11173,9 @@
         <w:pStyle w:val="Caption"/>
       </w:pPr>
       <w:r>
+        <w:rPr>
+          <w:noProof/>
+        </w:rPr>
         <w:drawing>
           <wp:inline distT="0" distB="0" distL="0" distR="0" wp14:anchorId="243BA14E" wp14:editId="5EF9FA77">
             <wp:extent cx="5942818" cy="1477107"/>
@@ -11434,45 +11215,25 @@
       <w:r>
         <w:t xml:space="preserve">Figure </w:t>
       </w:r>
-      <w:r>
-        <w:fldChar w:fldCharType="begin"/>
-      </w:r>
-      <w:r>
-        <w:instrText xml:space="preserve"> STYLEREF 1 \s </w:instrText>
-      </w:r>
-      <w:r>
-        <w:fldChar w:fldCharType="separate"/>
-      </w:r>
-      <w:r>
-        <w:rPr>
-          <w:noProof/>
-        </w:rPr>
-        <w:t>0</w:t>
-      </w:r>
-      <w:r>
-        <w:fldChar w:fldCharType="end"/>
-      </w:r>
+      <w:fldSimple w:instr=" STYLEREF 1 \s ">
+        <w:r>
+          <w:rPr>
+            <w:noProof/>
+          </w:rPr>
+          <w:t>0</w:t>
+        </w:r>
+      </w:fldSimple>
       <w:r>
         <w:noBreakHyphen/>
       </w:r>
-      <w:r>
-        <w:fldChar w:fldCharType="begin"/>
-      </w:r>
-      <w:r>
-        <w:instrText xml:space="preserve"> SEQ Figure \* ARABIC \s 1 </w:instrText>
-      </w:r>
-      <w:r>
-        <w:fldChar w:fldCharType="separate"/>
-      </w:r>
-      <w:r>
-        <w:rPr>
-          <w:noProof/>
-        </w:rPr>
-        <w:t>6</w:t>
-      </w:r>
-      <w:r>
-        <w:fldChar w:fldCharType="end"/>
-      </w:r>
+      <w:fldSimple w:instr=" SEQ Figure \* ARABIC \s 1 ">
+        <w:r>
+          <w:rPr>
+            <w:noProof/>
+          </w:rPr>
+          <w:t>6</w:t>
+        </w:r>
+      </w:fldSimple>
       <w:r>
         <w:t>: New Book Record added(Happy Ever After)</w:t>
       </w:r>
@@ -11500,6 +11261,7 @@
       <w:r>
         <w:rPr>
           <w:rFonts w:ascii="Times New Roman" w:hAnsi="Times New Roman" w:cs="Times New Roman"/>
+          <w:noProof/>
         </w:rPr>
         <w:drawing>
           <wp:inline distT="0" distB="0" distL="0" distR="0" wp14:anchorId="08B0D324" wp14:editId="637286D3">
@@ -11545,45 +11307,25 @@
       <w:r>
         <w:t xml:space="preserve">Figure </w:t>
       </w:r>
-      <w:r>
-        <w:fldChar w:fldCharType="begin"/>
-      </w:r>
-      <w:r>
-        <w:instrText xml:space="preserve"> STYLEREF 1 \s </w:instrText>
-      </w:r>
-      <w:r>
-        <w:fldChar w:fldCharType="separate"/>
-      </w:r>
-      <w:r>
-        <w:rPr>
-          <w:noProof/>
-        </w:rPr>
-        <w:t>0</w:t>
-      </w:r>
-      <w:r>
-        <w:fldChar w:fldCharType="end"/>
-      </w:r>
+      <w:fldSimple w:instr=" STYLEREF 1 \s ">
+        <w:r>
+          <w:rPr>
+            <w:noProof/>
+          </w:rPr>
+          <w:t>0</w:t>
+        </w:r>
+      </w:fldSimple>
       <w:r>
         <w:noBreakHyphen/>
       </w:r>
-      <w:r>
-        <w:fldChar w:fldCharType="begin"/>
-      </w:r>
-      <w:r>
-        <w:instrText xml:space="preserve"> SEQ Figure \* ARABIC \s 1 </w:instrText>
-      </w:r>
-      <w:r>
-        <w:fldChar w:fldCharType="separate"/>
-      </w:r>
-      <w:r>
-        <w:rPr>
-          <w:noProof/>
-        </w:rPr>
-        <w:t>7</w:t>
-      </w:r>
-      <w:r>
-        <w:fldChar w:fldCharType="end"/>
-      </w:r>
+      <w:fldSimple w:instr=" SEQ Figure \* ARABIC \s 1 ">
+        <w:r>
+          <w:rPr>
+            <w:noProof/>
+          </w:rPr>
+          <w:t>7</w:t>
+        </w:r>
+      </w:fldSimple>
       <w:r>
         <w:t>:Delete Button flash message</w:t>
       </w:r>
@@ -11594,6 +11336,9 @@
         <w:keepNext/>
       </w:pPr>
       <w:r>
+        <w:rPr>
+          <w:noProof/>
+        </w:rPr>
         <w:drawing>
           <wp:inline distT="0" distB="0" distL="0" distR="0" wp14:anchorId="280C3B70" wp14:editId="0439B9F3">
             <wp:extent cx="5943600" cy="1296237"/>
@@ -11638,45 +11383,25 @@
       <w:r>
         <w:t xml:space="preserve">Figure </w:t>
       </w:r>
-      <w:r>
-        <w:fldChar w:fldCharType="begin"/>
-      </w:r>
-      <w:r>
-        <w:instrText xml:space="preserve"> STYLEREF 1 \s </w:instrText>
-      </w:r>
-      <w:r>
-        <w:fldChar w:fldCharType="separate"/>
-      </w:r>
-      <w:r>
-        <w:rPr>
-          <w:noProof/>
-        </w:rPr>
-        <w:t>0</w:t>
-      </w:r>
-      <w:r>
-        <w:fldChar w:fldCharType="end"/>
-      </w:r>
+      <w:fldSimple w:instr=" STYLEREF 1 \s ">
+        <w:r>
+          <w:rPr>
+            <w:noProof/>
+          </w:rPr>
+          <w:t>0</w:t>
+        </w:r>
+      </w:fldSimple>
       <w:r>
         <w:noBreakHyphen/>
       </w:r>
-      <w:r>
-        <w:fldChar w:fldCharType="begin"/>
-      </w:r>
-      <w:r>
-        <w:instrText xml:space="preserve"> SEQ Figure \* ARABIC \s 1 </w:instrText>
-      </w:r>
-      <w:r>
-        <w:fldChar w:fldCharType="separate"/>
-      </w:r>
-      <w:r>
-        <w:rPr>
-          <w:noProof/>
-        </w:rPr>
-        <w:t>8</w:t>
-      </w:r>
-      <w:r>
-        <w:fldChar w:fldCharType="end"/>
-      </w:r>
+      <w:fldSimple w:instr=" SEQ Figure \* ARABIC \s 1 ">
+        <w:r>
+          <w:rPr>
+            <w:noProof/>
+          </w:rPr>
+          <w:t>8</w:t>
+        </w:r>
+      </w:fldSimple>
       <w:r>
         <w:t>;Deleted record(Four Figure Mathematical Tables)</w:t>
       </w:r>
@@ -11696,6 +11421,7 @@
       <w:r>
         <w:rPr>
           <w:rFonts w:ascii="Times New Roman" w:hAnsi="Times New Roman" w:cs="Times New Roman"/>
+          <w:noProof/>
         </w:rPr>
         <w:drawing>
           <wp:inline distT="0" distB="0" distL="0" distR="0" wp14:anchorId="57989C0C" wp14:editId="3E8AAB4B">
@@ -11741,51 +11467,37 @@
       <w:r>
         <w:t xml:space="preserve">Figure </w:t>
       </w:r>
-      <w:r>
-        <w:fldChar w:fldCharType="begin"/>
-      </w:r>
-      <w:r>
-        <w:instrText xml:space="preserve"> STYLEREF 1 \s </w:instrText>
-      </w:r>
-      <w:r>
-        <w:fldChar w:fldCharType="separate"/>
-      </w:r>
-      <w:r>
-        <w:rPr>
-          <w:noProof/>
-        </w:rPr>
-        <w:t>0</w:t>
-      </w:r>
-      <w:r>
-        <w:fldChar w:fldCharType="end"/>
-      </w:r>
+      <w:fldSimple w:instr=" STYLEREF 1 \s ">
+        <w:r>
+          <w:rPr>
+            <w:noProof/>
+          </w:rPr>
+          <w:t>0</w:t>
+        </w:r>
+      </w:fldSimple>
       <w:r>
         <w:noBreakHyphen/>
       </w:r>
-      <w:r>
-        <w:fldChar w:fldCharType="begin"/>
-      </w:r>
-      <w:r>
-        <w:instrText xml:space="preserve"> SEQ Figure \* ARABIC \s 1 </w:instrText>
-      </w:r>
-      <w:r>
-        <w:fldChar w:fldCharType="separate"/>
-      </w:r>
-      <w:r>
-        <w:rPr>
-          <w:noProof/>
-        </w:rPr>
-        <w:t>9</w:t>
-      </w:r>
-      <w:r>
-        <w:fldChar w:fldCharType="end"/>
-      </w:r>
+      <w:fldSimple w:instr=" SEQ Figure \* ARABIC \s 1 ">
+        <w:r>
+          <w:rPr>
+            <w:noProof/>
+          </w:rPr>
+          <w:t>9</w:t>
+        </w:r>
+      </w:fldSimple>
       <w:r>
         <w:t>:Delete_product script</w:t>
       </w:r>
     </w:p>
     <w:p>
-      <w:r>
+      <w:pPr>
+        <w:keepNext/>
+      </w:pPr>
+      <w:r>
+        <w:rPr>
+          <w:noProof/>
+        </w:rPr>
         <w:drawing>
           <wp:inline distT="0" distB="0" distL="0" distR="0" wp14:anchorId="0FB27CEE" wp14:editId="09B635EE">
             <wp:extent cx="5943600" cy="783771"/>
@@ -11825,54 +11537,140 @@
     </w:p>
     <w:p>
       <w:pPr>
+        <w:pStyle w:val="Caption"/>
+      </w:pPr>
+      <w:r>
+        <w:t xml:space="preserve">Figure </w:t>
+      </w:r>
+      <w:fldSimple w:instr=" STYLEREF 1 \s ">
+        <w:r>
+          <w:rPr>
+            <w:noProof/>
+          </w:rPr>
+          <w:t>0</w:t>
+        </w:r>
+      </w:fldSimple>
+      <w:r>
+        <w:noBreakHyphen/>
+      </w:r>
+      <w:fldSimple w:instr=" SEQ Figure \* ARABIC \s 1 ">
+        <w:r>
+          <w:rPr>
+            <w:noProof/>
+          </w:rPr>
+          <w:t>10</w:t>
+        </w:r>
+      </w:fldSimple>
+      <w:r>
+        <w:t>; delete book prepared statements</w:t>
+      </w:r>
+    </w:p>
+    <w:p>
+      <w:pPr>
         <w:rPr>
           <w:color w:val="000000" w:themeColor="text1"/>
         </w:rPr>
       </w:pPr>
       <w:r>
-        <w:t xml:space="preserve">Use of prepared statement </w:t>
+        <w:rPr>
+          <w:rFonts w:ascii="Times New Roman" w:hAnsi="Times New Roman" w:cs="Times New Roman"/>
+        </w:rPr>
+        <w:br/>
+      </w:r>
+      <w:r>
+        <w:rPr>
+          <w:rFonts w:ascii="Times New Roman" w:hAnsi="Times New Roman" w:cs="Times New Roman"/>
+        </w:rPr>
+        <w:br/>
+      </w:r>
+    </w:p>
+    <w:p>
+      <w:pPr>
+        <w:rPr>
+          <w:b/>
+          <w:u w:val="single"/>
+        </w:rPr>
+      </w:pPr>
+      <w:r>
+        <w:rPr>
+          <w:b/>
+          <w:u w:val="single"/>
+        </w:rPr>
+        <w:t>REFLECTION</w:t>
+      </w:r>
+    </w:p>
+    <w:p>
+      <w:pPr>
+        <w:rPr>
+          <w:color w:val="000000" w:themeColor="text1"/>
+        </w:rPr>
+      </w:pPr>
+      <w:r>
+        <w:t xml:space="preserve">Figure 0-2 showsModularization- Seperated the database connection into its own dedicated  file creating a Module that is pulled into the other pages(File Inclusion) using the </w:t>
       </w:r>
       <w:r>
         <w:rPr>
           <w:i/>
           <w:color w:val="FF0000"/>
         </w:rPr>
-        <w:t>($stmt = $pdo-&gt;prepare("D</w:t>
+        <w:t>require_once__DIR__</w:t>
+      </w:r>
+      <w:r>
+        <w:rPr>
+          <w:color w:val="FF0000"/>
+        </w:rPr>
+        <w:t xml:space="preserve"> </w:t>
+      </w:r>
+      <w:r>
+        <w:rPr>
+          <w:color w:val="000000" w:themeColor="text1"/>
+        </w:rPr>
+        <w:t>method</w:t>
+      </w:r>
+      <w:r>
+        <w:rPr>
+          <w:color w:val="000000" w:themeColor="text1"/>
+        </w:rPr>
+        <w:t>.</w:t>
+      </w:r>
+      <w:r>
+        <w:t xml:space="preserve"> Figure 0-10 shows Use of prepared statement </w:t>
       </w:r>
       <w:r>
         <w:rPr>
           <w:i/>
           <w:color w:val="FF0000"/>
         </w:rPr>
-        <w:t xml:space="preserve">ELETE FROM books WHERE id = ?") </w:t>
-      </w:r>
-      <w:r>
-        <w:rPr>
-          <w:color w:val="000000" w:themeColor="text1"/>
-        </w:rPr>
-        <w:t>that provides a place holder for the book data .</w:t>
-      </w:r>
-      <w:r>
-        <w:rPr>
-          <w:color w:val="000000" w:themeColor="text1"/>
-        </w:rPr>
-        <w:t xml:space="preserve"> The </w:t>
-      </w:r>
-      <w:r>
-        <w:t xml:space="preserve"> </w:t>
+        <w:t>($stmt = $pdo-&gt;prepare("D</w:t>
       </w:r>
       <w:r>
         <w:rPr>
           <w:i/>
           <w:color w:val="FF0000"/>
         </w:rPr>
-        <w:t>if ($stmt-&gt;execute([$_POST['id']])</w:t>
+        <w:t xml:space="preserve">ELETE FROM books WHERE id = ?") </w:t>
+      </w:r>
+      <w:r>
+        <w:rPr>
+          <w:color w:val="000000" w:themeColor="text1"/>
+        </w:rPr>
+        <w:t xml:space="preserve">that provides a place holder for the book data . The </w:t>
+      </w:r>
+      <w:r>
+        <w:t xml:space="preserve"> </w:t>
       </w:r>
       <w:r>
         <w:rPr>
           <w:i/>
           <w:color w:val="FF0000"/>
         </w:rPr>
+        <w:t>if ($stmt-&gt;execute([$_POST['id']])</w:t>
+      </w:r>
+      <w:r>
+        <w:rPr>
+          <w:i/>
+          <w:color w:val="FF0000"/>
+        </w:rPr>
         <w:t>….l</w:t>
       </w:r>
       <w:r>
@@ -11913,18 +11711,6 @@
           <w:color w:val="000000" w:themeColor="text1"/>
         </w:rPr>
       </w:pPr>
-      <w:r>
-        <w:rPr>
-          <w:rFonts w:ascii="Times New Roman" w:hAnsi="Times New Roman" w:cs="Times New Roman"/>
-        </w:rPr>
-        <w:br/>
-      </w:r>
-      <w:r>
-        <w:rPr>
-          <w:rFonts w:ascii="Times New Roman" w:hAnsi="Times New Roman" w:cs="Times New Roman"/>
-        </w:rPr>
-        <w:br/>
-      </w:r>
     </w:p>
     <w:p>
       <w:pPr>
@@ -11933,13 +11719,6 @@
           <w:u w:val="single"/>
         </w:rPr>
       </w:pPr>
-      <w:r>
-        <w:rPr>
-          <w:b/>
-          <w:u w:val="single"/>
-        </w:rPr>
-        <w:t>REFLECTION</w:t>
-      </w:r>
     </w:p>
     <w:p>
       <w:pPr>
@@ -12004,6 +11783,7 @@
         <w:rPr>
           <w:rFonts w:ascii="Times New Roman" w:hAnsi="Times New Roman" w:cs="Times New Roman"/>
           <w:b/>
+          <w:noProof/>
           <w:color w:val="000000" w:themeColor="text1"/>
           <w:sz w:val="52"/>
           <w:szCs w:val="52"/>
@@ -13739,6 +13519,7 @@
   <w:style w:type="character" w:default="1" w:styleId="DefaultParagraphFont">
     <w:name w:val="Default Paragraph Font"/>
     <w:uiPriority w:val="1"/>
+    <w:semiHidden/>
     <w:unhideWhenUsed/>
   </w:style>
   <w:style w:type="table" w:default="1" w:styleId="TableNormal">
@@ -14243,7 +14024,7 @@
 </file>
 
 <file path=customXml/itemProps1.xml><?xml version="1.0" encoding="utf-8"?>
-<ds:datastoreItem xmlns:ds="http://schemas.openxmlformats.org/officeDocument/2006/customXml" ds:itemID="{9F60CBC8-8BDA-432F-B4B4-BEA5421FF09A}">
+<ds:datastoreItem xmlns:ds="http://schemas.openxmlformats.org/officeDocument/2006/customXml" ds:itemID="{49D212B8-798C-4887-AEF3-89CDF20EEDA9}">
   <ds:schemaRefs>
     <ds:schemaRef ds:uri="http://schemas.openxmlformats.org/officeDocument/2006/bibliography"/>
   </ds:schemaRefs>

</xml_diff>

<commit_message>
finalized on week 7
</commit_message>
<xml_diff>
--- a/Week7/LOGBOOK/Log Book.docx
+++ b/Week7/LOGBOOK/Log Book.docx
@@ -5350,25 +5350,45 @@
                             <w:r>
                               <w:t xml:space="preserve">Figure </w:t>
                             </w:r>
-                            <w:fldSimple w:instr=" STYLEREF 1 \s ">
-                              <w:r>
-                                <w:rPr>
-                                  <w:noProof/>
-                                </w:rPr>
-                                <w:t>0</w:t>
-                              </w:r>
-                            </w:fldSimple>
+                            <w:r>
+                              <w:fldChar w:fldCharType="begin"/>
+                            </w:r>
+                            <w:r>
+                              <w:instrText xml:space="preserve"> STYLEREF 1 \s </w:instrText>
+                            </w:r>
+                            <w:r>
+                              <w:fldChar w:fldCharType="separate"/>
+                            </w:r>
+                            <w:r>
+                              <w:rPr>
+                                <w:noProof/>
+                              </w:rPr>
+                              <w:t>0</w:t>
+                            </w:r>
+                            <w:r>
+                              <w:fldChar w:fldCharType="end"/>
+                            </w:r>
                             <w:r>
                               <w:noBreakHyphen/>
                             </w:r>
-                            <w:fldSimple w:instr=" SEQ Figure \* ARABIC \s 1 ">
-                              <w:r>
-                                <w:rPr>
-                                  <w:noProof/>
-                                </w:rPr>
-                                <w:t>2</w:t>
-                              </w:r>
-                            </w:fldSimple>
+                            <w:r>
+                              <w:fldChar w:fldCharType="begin"/>
+                            </w:r>
+                            <w:r>
+                              <w:instrText xml:space="preserve"> SEQ Figure \* ARABIC \s 1 </w:instrText>
+                            </w:r>
+                            <w:r>
+                              <w:fldChar w:fldCharType="separate"/>
+                            </w:r>
+                            <w:r>
+                              <w:rPr>
+                                <w:noProof/>
+                              </w:rPr>
+                              <w:t>2</w:t>
+                            </w:r>
+                            <w:r>
+                              <w:fldChar w:fldCharType="end"/>
+                            </w:r>
                             <w:r>
                               <w:t>:Admin Dashboard</w:t>
                             </w:r>
@@ -5405,11 +5425,7 @@
           </mc:Choice>
           <mc:Fallback>
             <w:pict>
-              <v:shapetype w14:anchorId="61B4691D" id="_x0000_t202" coordsize="21600,21600" o:spt="202" path="m,l,21600r21600,l21600,xe">
-                <v:stroke joinstyle="miter"/>
-                <v:path gradientshapeok="t" o:connecttype="rect"/>
-              </v:shapetype>
-              <v:shape id="Text Box 24" o:spid="_x0000_s1027" type="#_x0000_t202" style="position:absolute;margin-left:0;margin-top:110.2pt;width:329.25pt;height:18.4pt;z-index:251656704;visibility:visible;mso-wrap-style:square;mso-height-percent:0;mso-wrap-distance-left:9pt;mso-wrap-distance-top:0;mso-wrap-distance-right:9pt;mso-wrap-distance-bottom:0;mso-position-horizontal:left;mso-position-horizontal-relative:margin;mso-position-vertical:absolute;mso-position-vertical-relative:text;mso-height-percent:0;mso-height-relative:margin;v-text-anchor:top" o:gfxdata="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" stroked="f">
+              <v:shape w14:anchorId="61B4691D" id="Text Box 24" o:spid="_x0000_s1027" type="#_x0000_t202" style="position:absolute;margin-left:0;margin-top:110.2pt;width:329.25pt;height:18.4pt;z-index:251656704;visibility:visible;mso-wrap-style:square;mso-height-percent:0;mso-wrap-distance-left:9pt;mso-wrap-distance-top:0;mso-wrap-distance-right:9pt;mso-wrap-distance-bottom:0;mso-position-horizontal:left;mso-position-horizontal-relative:margin;mso-position-vertical:absolute;mso-position-vertical-relative:text;mso-height-percent:0;mso-height-relative:margin;v-text-anchor:top" o:gfxdata="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" stroked="f">
                 <v:textbox inset="0,0,0,0">
                   <w:txbxContent>
                     <w:p>
@@ -5420,25 +5436,45 @@
                       <w:r>
                         <w:t xml:space="preserve">Figure </w:t>
                       </w:r>
-                      <w:fldSimple w:instr=" STYLEREF 1 \s ">
-                        <w:r>
-                          <w:rPr>
-                            <w:noProof/>
-                          </w:rPr>
-                          <w:t>0</w:t>
-                        </w:r>
-                      </w:fldSimple>
+                      <w:r>
+                        <w:fldChar w:fldCharType="begin"/>
+                      </w:r>
+                      <w:r>
+                        <w:instrText xml:space="preserve"> STYLEREF 1 \s </w:instrText>
+                      </w:r>
+                      <w:r>
+                        <w:fldChar w:fldCharType="separate"/>
+                      </w:r>
+                      <w:r>
+                        <w:rPr>
+                          <w:noProof/>
+                        </w:rPr>
+                        <w:t>0</w:t>
+                      </w:r>
+                      <w:r>
+                        <w:fldChar w:fldCharType="end"/>
+                      </w:r>
                       <w:r>
                         <w:noBreakHyphen/>
                       </w:r>
-                      <w:fldSimple w:instr=" SEQ Figure \* ARABIC \s 1 ">
-                        <w:r>
-                          <w:rPr>
-                            <w:noProof/>
-                          </w:rPr>
-                          <w:t>2</w:t>
-                        </w:r>
-                      </w:fldSimple>
+                      <w:r>
+                        <w:fldChar w:fldCharType="begin"/>
+                      </w:r>
+                      <w:r>
+                        <w:instrText xml:space="preserve"> SEQ Figure \* ARABIC \s 1 </w:instrText>
+                      </w:r>
+                      <w:r>
+                        <w:fldChar w:fldCharType="separate"/>
+                      </w:r>
+                      <w:r>
+                        <w:rPr>
+                          <w:noProof/>
+                        </w:rPr>
+                        <w:t>2</w:t>
+                      </w:r>
+                      <w:r>
+                        <w:fldChar w:fldCharType="end"/>
+                      </w:r>
                       <w:r>
                         <w:t>:Admin Dashboard</w:t>
                       </w:r>
@@ -9390,25 +9426,45 @@
       <w:r>
         <w:t xml:space="preserve">Figure </w:t>
       </w:r>
-      <w:fldSimple w:instr=" STYLEREF 1 \s ">
-        <w:r>
-          <w:rPr>
-            <w:noProof/>
-          </w:rPr>
-          <w:t>0</w:t>
-        </w:r>
-      </w:fldSimple>
+      <w:r>
+        <w:fldChar w:fldCharType="begin"/>
+      </w:r>
+      <w:r>
+        <w:instrText xml:space="preserve"> STYLEREF 1 \s </w:instrText>
+      </w:r>
+      <w:r>
+        <w:fldChar w:fldCharType="separate"/>
+      </w:r>
+      <w:r>
+        <w:rPr>
+          <w:noProof/>
+        </w:rPr>
+        <w:t>0</w:t>
+      </w:r>
+      <w:r>
+        <w:fldChar w:fldCharType="end"/>
+      </w:r>
       <w:r>
         <w:noBreakHyphen/>
       </w:r>
-      <w:fldSimple w:instr=" SEQ Figure \* ARABIC \s 1 ">
-        <w:r>
-          <w:rPr>
-            <w:noProof/>
-          </w:rPr>
-          <w:t>2</w:t>
-        </w:r>
-      </w:fldSimple>
+      <w:r>
+        <w:fldChar w:fldCharType="begin"/>
+      </w:r>
+      <w:r>
+        <w:instrText xml:space="preserve"> SEQ Figure \* ARABIC \s 1 </w:instrText>
+      </w:r>
+      <w:r>
+        <w:fldChar w:fldCharType="separate"/>
+      </w:r>
+      <w:r>
+        <w:rPr>
+          <w:noProof/>
+        </w:rPr>
+        <w:t>2</w:t>
+      </w:r>
+      <w:r>
+        <w:fldChar w:fldCharType="end"/>
+      </w:r>
       <w:r>
         <w:t>:SQL Script CREATE Books Table and Insert</w:t>
       </w:r>
@@ -9472,25 +9528,45 @@
       <w:r>
         <w:t xml:space="preserve">Figure </w:t>
       </w:r>
-      <w:fldSimple w:instr=" STYLEREF 1 \s ">
-        <w:r>
-          <w:rPr>
-            <w:noProof/>
-          </w:rPr>
-          <w:t>0</w:t>
-        </w:r>
-      </w:fldSimple>
+      <w:r>
+        <w:fldChar w:fldCharType="begin"/>
+      </w:r>
+      <w:r>
+        <w:instrText xml:space="preserve"> STYLEREF 1 \s </w:instrText>
+      </w:r>
+      <w:r>
+        <w:fldChar w:fldCharType="separate"/>
+      </w:r>
+      <w:r>
+        <w:rPr>
+          <w:noProof/>
+        </w:rPr>
+        <w:t>0</w:t>
+      </w:r>
+      <w:r>
+        <w:fldChar w:fldCharType="end"/>
+      </w:r>
       <w:r>
         <w:noBreakHyphen/>
       </w:r>
-      <w:fldSimple w:instr=" SEQ Figure \* ARABIC \s 1 ">
-        <w:r>
-          <w:rPr>
-            <w:noProof/>
-          </w:rPr>
-          <w:t>3</w:t>
-        </w:r>
-      </w:fldSimple>
+      <w:r>
+        <w:fldChar w:fldCharType="begin"/>
+      </w:r>
+      <w:r>
+        <w:instrText xml:space="preserve"> SEQ Figure \* ARABIC \s 1 </w:instrText>
+      </w:r>
+      <w:r>
+        <w:fldChar w:fldCharType="separate"/>
+      </w:r>
+      <w:r>
+        <w:rPr>
+          <w:noProof/>
+        </w:rPr>
+        <w:t>3</w:t>
+      </w:r>
+      <w:r>
+        <w:fldChar w:fldCharType="end"/>
+      </w:r>
       <w:r>
         <w:t>: Books Table with Sample book records</w:t>
       </w:r>
@@ -10007,25 +10083,45 @@
       <w:r>
         <w:t xml:space="preserve">Figure </w:t>
       </w:r>
-      <w:fldSimple w:instr=" STYLEREF 1 \s ">
-        <w:r>
-          <w:rPr>
-            <w:noProof/>
-          </w:rPr>
-          <w:t>0</w:t>
-        </w:r>
-      </w:fldSimple>
+      <w:r>
+        <w:fldChar w:fldCharType="begin"/>
+      </w:r>
+      <w:r>
+        <w:instrText xml:space="preserve"> STYLEREF 1 \s </w:instrText>
+      </w:r>
+      <w:r>
+        <w:fldChar w:fldCharType="separate"/>
+      </w:r>
+      <w:r>
+        <w:rPr>
+          <w:noProof/>
+        </w:rPr>
+        <w:t>0</w:t>
+      </w:r>
+      <w:r>
+        <w:fldChar w:fldCharType="end"/>
+      </w:r>
       <w:r>
         <w:noBreakHyphen/>
       </w:r>
-      <w:fldSimple w:instr=" SEQ Figure \* ARABIC \s 1 ">
-        <w:r>
-          <w:rPr>
-            <w:noProof/>
-          </w:rPr>
-          <w:t>7</w:t>
-        </w:r>
-      </w:fldSimple>
+      <w:r>
+        <w:fldChar w:fldCharType="begin"/>
+      </w:r>
+      <w:r>
+        <w:instrText xml:space="preserve"> SEQ Figure \* ARABIC \s 1 </w:instrText>
+      </w:r>
+      <w:r>
+        <w:fldChar w:fldCharType="separate"/>
+      </w:r>
+      <w:r>
+        <w:rPr>
+          <w:noProof/>
+        </w:rPr>
+        <w:t>7</w:t>
+      </w:r>
+      <w:r>
+        <w:fldChar w:fldCharType="end"/>
+      </w:r>
       <w:r>
         <w:t>; Top Cards</w:t>
       </w:r>
@@ -10083,25 +10179,45 @@
       <w:r>
         <w:t xml:space="preserve">Figure </w:t>
       </w:r>
-      <w:fldSimple w:instr=" STYLEREF 1 \s ">
-        <w:r>
-          <w:rPr>
-            <w:noProof/>
-          </w:rPr>
-          <w:t>0</w:t>
-        </w:r>
-      </w:fldSimple>
+      <w:r>
+        <w:fldChar w:fldCharType="begin"/>
+      </w:r>
+      <w:r>
+        <w:instrText xml:space="preserve"> STYLEREF 1 \s </w:instrText>
+      </w:r>
+      <w:r>
+        <w:fldChar w:fldCharType="separate"/>
+      </w:r>
+      <w:r>
+        <w:rPr>
+          <w:noProof/>
+        </w:rPr>
+        <w:t>0</w:t>
+      </w:r>
+      <w:r>
+        <w:fldChar w:fldCharType="end"/>
+      </w:r>
       <w:r>
         <w:noBreakHyphen/>
       </w:r>
-      <w:fldSimple w:instr=" SEQ Figure \* ARABIC \s 1 ">
-        <w:r>
-          <w:rPr>
-            <w:noProof/>
-          </w:rPr>
-          <w:t>8</w:t>
-        </w:r>
-      </w:fldSimple>
+      <w:r>
+        <w:fldChar w:fldCharType="begin"/>
+      </w:r>
+      <w:r>
+        <w:instrText xml:space="preserve"> SEQ Figure \* ARABIC \s 1 </w:instrText>
+      </w:r>
+      <w:r>
+        <w:fldChar w:fldCharType="separate"/>
+      </w:r>
+      <w:r>
+        <w:rPr>
+          <w:noProof/>
+        </w:rPr>
+        <w:t>8</w:t>
+      </w:r>
+      <w:r>
+        <w:fldChar w:fldCharType="end"/>
+      </w:r>
       <w:r>
         <w:t>:Edit Book records Form</w:t>
       </w:r>
@@ -10471,25 +10587,45 @@
       <w:r>
         <w:t xml:space="preserve">Figure </w:t>
       </w:r>
-      <w:fldSimple w:instr=" STYLEREF 1 \s ">
-        <w:r>
-          <w:rPr>
-            <w:noProof/>
-          </w:rPr>
-          <w:t>0</w:t>
-        </w:r>
-      </w:fldSimple>
+      <w:r>
+        <w:fldChar w:fldCharType="begin"/>
+      </w:r>
+      <w:r>
+        <w:instrText xml:space="preserve"> STYLEREF 1 \s </w:instrText>
+      </w:r>
+      <w:r>
+        <w:fldChar w:fldCharType="separate"/>
+      </w:r>
+      <w:r>
+        <w:rPr>
+          <w:noProof/>
+        </w:rPr>
+        <w:t>0</w:t>
+      </w:r>
+      <w:r>
+        <w:fldChar w:fldCharType="end"/>
+      </w:r>
       <w:r>
         <w:noBreakHyphen/>
       </w:r>
-      <w:fldSimple w:instr=" SEQ Figure \* ARABIC \s 1 ">
-        <w:r>
-          <w:rPr>
-            <w:noProof/>
-          </w:rPr>
-          <w:t>11</w:t>
-        </w:r>
-      </w:fldSimple>
+      <w:r>
+        <w:fldChar w:fldCharType="begin"/>
+      </w:r>
+      <w:r>
+        <w:instrText xml:space="preserve"> SEQ Figure \* ARABIC \s 1 </w:instrText>
+      </w:r>
+      <w:r>
+        <w:fldChar w:fldCharType="separate"/>
+      </w:r>
+      <w:r>
+        <w:rPr>
+          <w:noProof/>
+        </w:rPr>
+        <w:t>11</w:t>
+      </w:r>
+      <w:r>
+        <w:fldChar w:fldCharType="end"/>
+      </w:r>
       <w:r>
         <w:t>; Flash message showing Successful Update</w:t>
       </w:r>
@@ -10760,25 +10896,45 @@
       <w:r>
         <w:t xml:space="preserve">Figure </w:t>
       </w:r>
-      <w:fldSimple w:instr=" STYLEREF 1 \s ">
-        <w:r>
-          <w:rPr>
-            <w:noProof/>
-          </w:rPr>
-          <w:t>0</w:t>
-        </w:r>
-      </w:fldSimple>
+      <w:r>
+        <w:fldChar w:fldCharType="begin"/>
+      </w:r>
+      <w:r>
+        <w:instrText xml:space="preserve"> STYLEREF 1 \s </w:instrText>
+      </w:r>
+      <w:r>
+        <w:fldChar w:fldCharType="separate"/>
+      </w:r>
+      <w:r>
+        <w:rPr>
+          <w:noProof/>
+        </w:rPr>
+        <w:t>0</w:t>
+      </w:r>
+      <w:r>
+        <w:fldChar w:fldCharType="end"/>
+      </w:r>
       <w:r>
         <w:noBreakHyphen/>
       </w:r>
-      <w:fldSimple w:instr=" SEQ Figure \* ARABIC \s 1 ">
-        <w:r>
-          <w:rPr>
-            <w:noProof/>
-          </w:rPr>
-          <w:t>1</w:t>
-        </w:r>
-      </w:fldSimple>
+      <w:r>
+        <w:fldChar w:fldCharType="begin"/>
+      </w:r>
+      <w:r>
+        <w:instrText xml:space="preserve"> SEQ Figure \* ARABIC \s 1 </w:instrText>
+      </w:r>
+      <w:r>
+        <w:fldChar w:fldCharType="separate"/>
+      </w:r>
+      <w:r>
+        <w:rPr>
+          <w:noProof/>
+        </w:rPr>
+        <w:t>1</w:t>
+      </w:r>
+      <w:r>
+        <w:fldChar w:fldCharType="end"/>
+      </w:r>
       <w:r>
         <w:t>:Datab</w:t>
       </w:r>
@@ -10789,10 +10945,7 @@
         <w:t>se Connection Script</w:t>
       </w:r>
     </w:p>
-    <w:p>
-      <w:bookmarkStart w:id="75" w:name="_GoBack"/>
-      <w:bookmarkEnd w:id="75"/>
-    </w:p>
+    <w:p/>
     <w:p>
       <w:pPr>
         <w:keepNext/>
@@ -10845,25 +10998,45 @@
       <w:r>
         <w:t xml:space="preserve">Figure </w:t>
       </w:r>
-      <w:fldSimple w:instr=" STYLEREF 1 \s ">
-        <w:r>
-          <w:rPr>
-            <w:noProof/>
-          </w:rPr>
-          <w:t>0</w:t>
-        </w:r>
-      </w:fldSimple>
+      <w:r>
+        <w:fldChar w:fldCharType="begin"/>
+      </w:r>
+      <w:r>
+        <w:instrText xml:space="preserve"> STYLEREF 1 \s </w:instrText>
+      </w:r>
+      <w:r>
+        <w:fldChar w:fldCharType="separate"/>
+      </w:r>
+      <w:r>
+        <w:rPr>
+          <w:noProof/>
+        </w:rPr>
+        <w:t>0</w:t>
+      </w:r>
+      <w:r>
+        <w:fldChar w:fldCharType="end"/>
+      </w:r>
       <w:r>
         <w:noBreakHyphen/>
       </w:r>
-      <w:fldSimple w:instr=" SEQ Figure \* ARABIC \s 1 ">
-        <w:r>
-          <w:rPr>
-            <w:noProof/>
-          </w:rPr>
-          <w:t>2</w:t>
-        </w:r>
-      </w:fldSimple>
+      <w:r>
+        <w:fldChar w:fldCharType="begin"/>
+      </w:r>
+      <w:r>
+        <w:instrText xml:space="preserve"> SEQ Figure \* ARABIC \s 1 </w:instrText>
+      </w:r>
+      <w:r>
+        <w:fldChar w:fldCharType="separate"/>
+      </w:r>
+      <w:r>
+        <w:rPr>
+          <w:noProof/>
+        </w:rPr>
+        <w:t>2</w:t>
+      </w:r>
+      <w:r>
+        <w:fldChar w:fldCharType="end"/>
+      </w:r>
       <w:r>
         <w:t>: Connection script file inclusion</w:t>
       </w:r>
@@ -11057,25 +11230,45 @@
       <w:r>
         <w:t xml:space="preserve">Figure </w:t>
       </w:r>
-      <w:fldSimple w:instr=" STYLEREF 1 \s ">
-        <w:r>
-          <w:rPr>
-            <w:noProof/>
-          </w:rPr>
-          <w:t>0</w:t>
-        </w:r>
-      </w:fldSimple>
+      <w:r>
+        <w:fldChar w:fldCharType="begin"/>
+      </w:r>
+      <w:r>
+        <w:instrText xml:space="preserve"> STYLEREF 1 \s </w:instrText>
+      </w:r>
+      <w:r>
+        <w:fldChar w:fldCharType="separate"/>
+      </w:r>
+      <w:r>
+        <w:rPr>
+          <w:noProof/>
+        </w:rPr>
+        <w:t>0</w:t>
+      </w:r>
+      <w:r>
+        <w:fldChar w:fldCharType="end"/>
+      </w:r>
       <w:r>
         <w:noBreakHyphen/>
       </w:r>
-      <w:fldSimple w:instr=" SEQ Figure \* ARABIC \s 1 ">
-        <w:r>
-          <w:rPr>
-            <w:noProof/>
-          </w:rPr>
-          <w:t>4</w:t>
-        </w:r>
-      </w:fldSimple>
+      <w:r>
+        <w:fldChar w:fldCharType="begin"/>
+      </w:r>
+      <w:r>
+        <w:instrText xml:space="preserve"> SEQ Figure \* ARABIC \s 1 </w:instrText>
+      </w:r>
+      <w:r>
+        <w:fldChar w:fldCharType="separate"/>
+      </w:r>
+      <w:r>
+        <w:rPr>
+          <w:noProof/>
+        </w:rPr>
+        <w:t>4</w:t>
+      </w:r>
+      <w:r>
+        <w:fldChar w:fldCharType="end"/>
+      </w:r>
       <w:r>
         <w:t xml:space="preserve">;AddBook </w:t>
       </w:r>
@@ -11139,25 +11332,45 @@
       <w:r>
         <w:t xml:space="preserve">Figure </w:t>
       </w:r>
-      <w:fldSimple w:instr=" STYLEREF 1 \s ">
-        <w:r>
-          <w:rPr>
-            <w:noProof/>
-          </w:rPr>
-          <w:t>0</w:t>
-        </w:r>
-      </w:fldSimple>
+      <w:r>
+        <w:fldChar w:fldCharType="begin"/>
+      </w:r>
+      <w:r>
+        <w:instrText xml:space="preserve"> STYLEREF 1 \s </w:instrText>
+      </w:r>
+      <w:r>
+        <w:fldChar w:fldCharType="separate"/>
+      </w:r>
+      <w:r>
+        <w:rPr>
+          <w:noProof/>
+        </w:rPr>
+        <w:t>0</w:t>
+      </w:r>
+      <w:r>
+        <w:fldChar w:fldCharType="end"/>
+      </w:r>
       <w:r>
         <w:noBreakHyphen/>
       </w:r>
-      <w:fldSimple w:instr=" SEQ Figure \* ARABIC \s 1 ">
-        <w:r>
-          <w:rPr>
-            <w:noProof/>
-          </w:rPr>
-          <w:t>5</w:t>
-        </w:r>
-      </w:fldSimple>
+      <w:r>
+        <w:fldChar w:fldCharType="begin"/>
+      </w:r>
+      <w:r>
+        <w:instrText xml:space="preserve"> SEQ Figure \* ARABIC \s 1 </w:instrText>
+      </w:r>
+      <w:r>
+        <w:fldChar w:fldCharType="separate"/>
+      </w:r>
+      <w:r>
+        <w:rPr>
+          <w:noProof/>
+        </w:rPr>
+        <w:t>5</w:t>
+      </w:r>
+      <w:r>
+        <w:fldChar w:fldCharType="end"/>
+      </w:r>
       <w:r>
         <w:t xml:space="preserve">; Error </w:t>
       </w:r>
@@ -11215,25 +11428,45 @@
       <w:r>
         <w:t xml:space="preserve">Figure </w:t>
       </w:r>
-      <w:fldSimple w:instr=" STYLEREF 1 \s ">
-        <w:r>
-          <w:rPr>
-            <w:noProof/>
-          </w:rPr>
-          <w:t>0</w:t>
-        </w:r>
-      </w:fldSimple>
+      <w:r>
+        <w:fldChar w:fldCharType="begin"/>
+      </w:r>
+      <w:r>
+        <w:instrText xml:space="preserve"> STYLEREF 1 \s </w:instrText>
+      </w:r>
+      <w:r>
+        <w:fldChar w:fldCharType="separate"/>
+      </w:r>
+      <w:r>
+        <w:rPr>
+          <w:noProof/>
+        </w:rPr>
+        <w:t>0</w:t>
+      </w:r>
+      <w:r>
+        <w:fldChar w:fldCharType="end"/>
+      </w:r>
       <w:r>
         <w:noBreakHyphen/>
       </w:r>
-      <w:fldSimple w:instr=" SEQ Figure \* ARABIC \s 1 ">
-        <w:r>
-          <w:rPr>
-            <w:noProof/>
-          </w:rPr>
-          <w:t>6</w:t>
-        </w:r>
-      </w:fldSimple>
+      <w:r>
+        <w:fldChar w:fldCharType="begin"/>
+      </w:r>
+      <w:r>
+        <w:instrText xml:space="preserve"> SEQ Figure \* ARABIC \s 1 </w:instrText>
+      </w:r>
+      <w:r>
+        <w:fldChar w:fldCharType="separate"/>
+      </w:r>
+      <w:r>
+        <w:rPr>
+          <w:noProof/>
+        </w:rPr>
+        <w:t>6</w:t>
+      </w:r>
+      <w:r>
+        <w:fldChar w:fldCharType="end"/>
+      </w:r>
       <w:r>
         <w:t>: New Book Record added(Happy Ever After)</w:t>
       </w:r>
@@ -11307,25 +11540,45 @@
       <w:r>
         <w:t xml:space="preserve">Figure </w:t>
       </w:r>
-      <w:fldSimple w:instr=" STYLEREF 1 \s ">
-        <w:r>
-          <w:rPr>
-            <w:noProof/>
-          </w:rPr>
-          <w:t>0</w:t>
-        </w:r>
-      </w:fldSimple>
+      <w:r>
+        <w:fldChar w:fldCharType="begin"/>
+      </w:r>
+      <w:r>
+        <w:instrText xml:space="preserve"> STYLEREF 1 \s </w:instrText>
+      </w:r>
+      <w:r>
+        <w:fldChar w:fldCharType="separate"/>
+      </w:r>
+      <w:r>
+        <w:rPr>
+          <w:noProof/>
+        </w:rPr>
+        <w:t>0</w:t>
+      </w:r>
+      <w:r>
+        <w:fldChar w:fldCharType="end"/>
+      </w:r>
       <w:r>
         <w:noBreakHyphen/>
       </w:r>
-      <w:fldSimple w:instr=" SEQ Figure \* ARABIC \s 1 ">
-        <w:r>
-          <w:rPr>
-            <w:noProof/>
-          </w:rPr>
-          <w:t>7</w:t>
-        </w:r>
-      </w:fldSimple>
+      <w:r>
+        <w:fldChar w:fldCharType="begin"/>
+      </w:r>
+      <w:r>
+        <w:instrText xml:space="preserve"> SEQ Figure \* ARABIC \s 1 </w:instrText>
+      </w:r>
+      <w:r>
+        <w:fldChar w:fldCharType="separate"/>
+      </w:r>
+      <w:r>
+        <w:rPr>
+          <w:noProof/>
+        </w:rPr>
+        <w:t>7</w:t>
+      </w:r>
+      <w:r>
+        <w:fldChar w:fldCharType="end"/>
+      </w:r>
       <w:r>
         <w:t>:Delete Button flash message</w:t>
       </w:r>
@@ -11383,25 +11636,45 @@
       <w:r>
         <w:t xml:space="preserve">Figure </w:t>
       </w:r>
-      <w:fldSimple w:instr=" STYLEREF 1 \s ">
-        <w:r>
-          <w:rPr>
-            <w:noProof/>
-          </w:rPr>
-          <w:t>0</w:t>
-        </w:r>
-      </w:fldSimple>
+      <w:r>
+        <w:fldChar w:fldCharType="begin"/>
+      </w:r>
+      <w:r>
+        <w:instrText xml:space="preserve"> STYLEREF 1 \s </w:instrText>
+      </w:r>
+      <w:r>
+        <w:fldChar w:fldCharType="separate"/>
+      </w:r>
+      <w:r>
+        <w:rPr>
+          <w:noProof/>
+        </w:rPr>
+        <w:t>0</w:t>
+      </w:r>
+      <w:r>
+        <w:fldChar w:fldCharType="end"/>
+      </w:r>
       <w:r>
         <w:noBreakHyphen/>
       </w:r>
-      <w:fldSimple w:instr=" SEQ Figure \* ARABIC \s 1 ">
-        <w:r>
-          <w:rPr>
-            <w:noProof/>
-          </w:rPr>
-          <w:t>8</w:t>
-        </w:r>
-      </w:fldSimple>
+      <w:r>
+        <w:fldChar w:fldCharType="begin"/>
+      </w:r>
+      <w:r>
+        <w:instrText xml:space="preserve"> SEQ Figure \* ARABIC \s 1 </w:instrText>
+      </w:r>
+      <w:r>
+        <w:fldChar w:fldCharType="separate"/>
+      </w:r>
+      <w:r>
+        <w:rPr>
+          <w:noProof/>
+        </w:rPr>
+        <w:t>8</w:t>
+      </w:r>
+      <w:r>
+        <w:fldChar w:fldCharType="end"/>
+      </w:r>
       <w:r>
         <w:t>;Deleted record(Four Figure Mathematical Tables)</w:t>
       </w:r>
@@ -11467,25 +11740,45 @@
       <w:r>
         <w:t xml:space="preserve">Figure </w:t>
       </w:r>
-      <w:fldSimple w:instr=" STYLEREF 1 \s ">
-        <w:r>
-          <w:rPr>
-            <w:noProof/>
-          </w:rPr>
-          <w:t>0</w:t>
-        </w:r>
-      </w:fldSimple>
+      <w:r>
+        <w:fldChar w:fldCharType="begin"/>
+      </w:r>
+      <w:r>
+        <w:instrText xml:space="preserve"> STYLEREF 1 \s </w:instrText>
+      </w:r>
+      <w:r>
+        <w:fldChar w:fldCharType="separate"/>
+      </w:r>
+      <w:r>
+        <w:rPr>
+          <w:noProof/>
+        </w:rPr>
+        <w:t>0</w:t>
+      </w:r>
+      <w:r>
+        <w:fldChar w:fldCharType="end"/>
+      </w:r>
       <w:r>
         <w:noBreakHyphen/>
       </w:r>
-      <w:fldSimple w:instr=" SEQ Figure \* ARABIC \s 1 ">
-        <w:r>
-          <w:rPr>
-            <w:noProof/>
-          </w:rPr>
-          <w:t>9</w:t>
-        </w:r>
-      </w:fldSimple>
+      <w:r>
+        <w:fldChar w:fldCharType="begin"/>
+      </w:r>
+      <w:r>
+        <w:instrText xml:space="preserve"> SEQ Figure \* ARABIC \s 1 </w:instrText>
+      </w:r>
+      <w:r>
+        <w:fldChar w:fldCharType="separate"/>
+      </w:r>
+      <w:r>
+        <w:rPr>
+          <w:noProof/>
+        </w:rPr>
+        <w:t>9</w:t>
+      </w:r>
+      <w:r>
+        <w:fldChar w:fldCharType="end"/>
+      </w:r>
       <w:r>
         <w:t>:Delete_product script</w:t>
       </w:r>
@@ -11542,25 +11835,45 @@
       <w:r>
         <w:t xml:space="preserve">Figure </w:t>
       </w:r>
-      <w:fldSimple w:instr=" STYLEREF 1 \s ">
-        <w:r>
-          <w:rPr>
-            <w:noProof/>
-          </w:rPr>
-          <w:t>0</w:t>
-        </w:r>
-      </w:fldSimple>
+      <w:r>
+        <w:fldChar w:fldCharType="begin"/>
+      </w:r>
+      <w:r>
+        <w:instrText xml:space="preserve"> STYLEREF 1 \s </w:instrText>
+      </w:r>
+      <w:r>
+        <w:fldChar w:fldCharType="separate"/>
+      </w:r>
+      <w:r>
+        <w:rPr>
+          <w:noProof/>
+        </w:rPr>
+        <w:t>0</w:t>
+      </w:r>
+      <w:r>
+        <w:fldChar w:fldCharType="end"/>
+      </w:r>
       <w:r>
         <w:noBreakHyphen/>
       </w:r>
-      <w:fldSimple w:instr=" SEQ Figure \* ARABIC \s 1 ">
-        <w:r>
-          <w:rPr>
-            <w:noProof/>
-          </w:rPr>
-          <w:t>10</w:t>
-        </w:r>
-      </w:fldSimple>
+      <w:r>
+        <w:fldChar w:fldCharType="begin"/>
+      </w:r>
+      <w:r>
+        <w:instrText xml:space="preserve"> SEQ Figure \* ARABIC \s 1 </w:instrText>
+      </w:r>
+      <w:r>
+        <w:fldChar w:fldCharType="separate"/>
+      </w:r>
+      <w:r>
+        <w:rPr>
+          <w:noProof/>
+        </w:rPr>
+        <w:t>10</w:t>
+      </w:r>
+      <w:r>
+        <w:fldChar w:fldCharType="end"/>
+      </w:r>
       <w:r>
         <w:t>; delete book prepared statements</w:t>
       </w:r>
@@ -11586,14 +11899,17 @@
     </w:p>
     <w:p>
       <w:pPr>
+        <w:pStyle w:val="Heading2"/>
         <w:rPr>
           <w:b/>
+          <w:color w:val="auto"/>
           <w:u w:val="single"/>
         </w:rPr>
       </w:pPr>
       <w:r>
         <w:rPr>
           <w:b/>
+          <w:color w:val="auto"/>
           <w:u w:val="single"/>
         </w:rPr>
         <w:t>REFLECTION</w:t>
@@ -11748,15 +12064,6 @@
     <w:p>
       <w:pPr>
         <w:pStyle w:val="Heading1"/>
-        <w:rPr>
-          <w:rFonts w:ascii="Times New Roman" w:hAnsi="Times New Roman" w:cs="Times New Roman"/>
-          <w:b/>
-          <w:color w:val="000000" w:themeColor="text1"/>
-          <w:sz w:val="52"/>
-          <w:szCs w:val="52"/>
-        </w:rPr>
-      </w:pPr>
-      <w:r>
         <w:rPr>
           <w:rFonts w:ascii="Times New Roman" w:eastAsia="Times New Roman" w:hAnsi="Times New Roman" w:cs="Times New Roman"/>
           <w:b/>
@@ -11767,8 +12074,25 @@
           <w:szCs w:val="36"/>
           <w:u w:val="single"/>
         </w:rPr>
+      </w:pPr>
+      <w:r>
+        <w:rPr>
+          <w:rFonts w:ascii="Times New Roman" w:eastAsia="Times New Roman" w:hAnsi="Times New Roman" w:cs="Times New Roman"/>
+          <w:b/>
+          <w:bCs/>
+          <w:color w:val="auto"/>
+          <w:kern w:val="36"/>
+          <w:sz w:val="36"/>
+          <w:szCs w:val="36"/>
+          <w:u w:val="single"/>
+        </w:rPr>
         <w:t>User Authentication and Session Management</w:t>
       </w:r>
+    </w:p>
+    <w:p>
+      <w:pPr>
+        <w:pStyle w:val="Heading1"/>
+      </w:pPr>
       <w:r>
         <w:rPr>
           <w:rFonts w:ascii="Times New Roman" w:hAnsi="Times New Roman" w:cs="Times New Roman"/>
@@ -11777,22 +12101,11 @@
           <w:sz w:val="52"/>
           <w:szCs w:val="52"/>
         </w:rPr>
-        <w:br/>
-      </w:r>
-      <w:r>
-        <w:rPr>
-          <w:rFonts w:ascii="Times New Roman" w:hAnsi="Times New Roman" w:cs="Times New Roman"/>
-          <w:b/>
-          <w:noProof/>
-          <w:color w:val="000000" w:themeColor="text1"/>
-          <w:sz w:val="52"/>
-          <w:szCs w:val="52"/>
-        </w:rPr>
         <w:drawing>
-          <wp:inline distT="0" distB="0" distL="0" distR="0" wp14:anchorId="1470E269" wp14:editId="00A76426">
-            <wp:extent cx="5277587" cy="2086266"/>
-            <wp:effectExtent l="0" t="0" r="0" b="9525"/>
-            <wp:docPr id="39" name="Picture 39"/>
+          <wp:inline distT="0" distB="0" distL="0" distR="0" wp14:anchorId="208B3D62" wp14:editId="6F1671C5">
+            <wp:extent cx="5787230" cy="3268301"/>
+            <wp:effectExtent l="0" t="0" r="4445" b="8890"/>
+            <wp:docPr id="32" name="Picture 32"/>
             <wp:cNvGraphicFramePr>
               <a:graphicFrameLocks xmlns:a="http://schemas.openxmlformats.org/drawingml/2006/main" noChangeAspect="1"/>
             </wp:cNvGraphicFramePr>
@@ -11812,6 +12125,828 @@
                   <pic:spPr>
                     <a:xfrm>
                       <a:off x="0" y="0"/>
+                      <a:ext cx="5787230" cy="3268301"/>
+                    </a:xfrm>
+                    <a:prstGeom prst="rect">
+                      <a:avLst/>
+                    </a:prstGeom>
+                  </pic:spPr>
+                </pic:pic>
+              </a:graphicData>
+            </a:graphic>
+          </wp:inline>
+        </w:drawing>
+      </w:r>
+    </w:p>
+    <w:p>
+      <w:pPr>
+        <w:pStyle w:val="Caption"/>
+      </w:pPr>
+      <w:r>
+        <w:t xml:space="preserve">Figure </w:t>
+      </w:r>
+      <w:r>
+        <w:fldChar w:fldCharType="begin"/>
+      </w:r>
+      <w:r>
+        <w:instrText xml:space="preserve"> STYLEREF 1 \s </w:instrText>
+      </w:r>
+      <w:r>
+        <w:fldChar w:fldCharType="separate"/>
+      </w:r>
+      <w:r>
+        <w:rPr>
+          <w:noProof/>
+        </w:rPr>
+        <w:t>0</w:t>
+      </w:r>
+      <w:r>
+        <w:fldChar w:fldCharType="end"/>
+      </w:r>
+      <w:r>
+        <w:noBreakHyphen/>
+      </w:r>
+      <w:r>
+        <w:fldChar w:fldCharType="begin"/>
+      </w:r>
+      <w:r>
+        <w:instrText xml:space="preserve"> SEQ Figure \* ARABIC \s 1 </w:instrText>
+      </w:r>
+      <w:r>
+        <w:fldChar w:fldCharType="separate"/>
+      </w:r>
+      <w:r>
+        <w:rPr>
+          <w:noProof/>
+        </w:rPr>
+        <w:t>1</w:t>
+      </w:r>
+      <w:r>
+        <w:fldChar w:fldCharType="end"/>
+      </w:r>
+      <w:r>
+        <w:t>:Admin Role View(Role Based Login)</w:t>
+      </w:r>
+    </w:p>
+    <w:p>
+      <w:pPr>
+        <w:pStyle w:val="Caption"/>
+      </w:pPr>
+      <w:r>
+        <w:drawing>
+          <wp:inline distT="0" distB="0" distL="0" distR="0" wp14:anchorId="4170223B" wp14:editId="68192B36">
+            <wp:extent cx="4437340" cy="2516863"/>
+            <wp:effectExtent l="0" t="0" r="1905" b="0"/>
+            <wp:docPr id="33" name="Picture 33"/>
+            <wp:cNvGraphicFramePr>
+              <a:graphicFrameLocks xmlns:a="http://schemas.openxmlformats.org/drawingml/2006/main" noChangeAspect="1"/>
+            </wp:cNvGraphicFramePr>
+            <a:graphic xmlns:a="http://schemas.openxmlformats.org/drawingml/2006/main">
+              <a:graphicData uri="http://schemas.openxmlformats.org/drawingml/2006/picture">
+                <pic:pic xmlns:pic="http://schemas.openxmlformats.org/drawingml/2006/picture">
+                  <pic:nvPicPr>
+                    <pic:cNvPr id="1" name=""/>
+                    <pic:cNvPicPr/>
+                  </pic:nvPicPr>
+                  <pic:blipFill>
+                    <a:blip r:embed="rId58"/>
+                    <a:stretch>
+                      <a:fillRect/>
+                    </a:stretch>
+                  </pic:blipFill>
+                  <pic:spPr>
+                    <a:xfrm>
+                      <a:off x="0" y="0"/>
+                      <a:ext cx="4451244" cy="2524749"/>
+                    </a:xfrm>
+                    <a:prstGeom prst="rect">
+                      <a:avLst/>
+                    </a:prstGeom>
+                  </pic:spPr>
+                </pic:pic>
+              </a:graphicData>
+            </a:graphic>
+          </wp:inline>
+        </w:drawing>
+      </w:r>
+    </w:p>
+    <w:p>
+      <w:pPr>
+        <w:pStyle w:val="Caption"/>
+      </w:pPr>
+      <w:r>
+        <w:t xml:space="preserve">Figure </w:t>
+      </w:r>
+      <w:r>
+        <w:fldChar w:fldCharType="begin"/>
+      </w:r>
+      <w:r>
+        <w:instrText xml:space="preserve"> STYLEREF 1 \s </w:instrText>
+      </w:r>
+      <w:r>
+        <w:fldChar w:fldCharType="separate"/>
+      </w:r>
+      <w:r>
+        <w:rPr>
+          <w:noProof/>
+        </w:rPr>
+        <w:t>0</w:t>
+      </w:r>
+      <w:r>
+        <w:fldChar w:fldCharType="end"/>
+      </w:r>
+      <w:r>
+        <w:noBreakHyphen/>
+      </w:r>
+      <w:r>
+        <w:fldChar w:fldCharType="begin"/>
+      </w:r>
+      <w:r>
+        <w:instrText xml:space="preserve"> SEQ Figure \* ARABIC \s 1 </w:instrText>
+      </w:r>
+      <w:r>
+        <w:fldChar w:fldCharType="separate"/>
+      </w:r>
+      <w:r>
+        <w:rPr>
+          <w:noProof/>
+        </w:rPr>
+        <w:t>2</w:t>
+      </w:r>
+      <w:r>
+        <w:fldChar w:fldCharType="end"/>
+      </w:r>
+      <w:r>
+        <w:t>; Manager role view</w:t>
+      </w:r>
+    </w:p>
+    <w:p>
+      <w:pPr>
+        <w:keepNext/>
+      </w:pPr>
+      <w:r>
+        <w:lastRenderedPageBreak/>
+        <w:drawing>
+          <wp:inline distT="0" distB="0" distL="0" distR="0" wp14:anchorId="336AEB2E" wp14:editId="114EBEDF">
+            <wp:extent cx="4054118" cy="1004935"/>
+            <wp:effectExtent l="0" t="0" r="3810" b="5080"/>
+            <wp:docPr id="44" name="Picture 44"/>
+            <wp:cNvGraphicFramePr>
+              <a:graphicFrameLocks xmlns:a="http://schemas.openxmlformats.org/drawingml/2006/main" noChangeAspect="1"/>
+            </wp:cNvGraphicFramePr>
+            <a:graphic xmlns:a="http://schemas.openxmlformats.org/drawingml/2006/main">
+              <a:graphicData uri="http://schemas.openxmlformats.org/drawingml/2006/picture">
+                <pic:pic xmlns:pic="http://schemas.openxmlformats.org/drawingml/2006/picture">
+                  <pic:nvPicPr>
+                    <pic:cNvPr id="1" name=""/>
+                    <pic:cNvPicPr/>
+                  </pic:nvPicPr>
+                  <pic:blipFill>
+                    <a:blip r:embed="rId59"/>
+                    <a:stretch>
+                      <a:fillRect/>
+                    </a:stretch>
+                  </pic:blipFill>
+                  <pic:spPr>
+                    <a:xfrm>
+                      <a:off x="0" y="0"/>
+                      <a:ext cx="4054118" cy="1004935"/>
+                    </a:xfrm>
+                    <a:prstGeom prst="rect">
+                      <a:avLst/>
+                    </a:prstGeom>
+                  </pic:spPr>
+                </pic:pic>
+              </a:graphicData>
+            </a:graphic>
+          </wp:inline>
+        </w:drawing>
+      </w:r>
+    </w:p>
+    <w:p>
+      <w:pPr>
+        <w:pStyle w:val="Caption"/>
+      </w:pPr>
+      <w:r>
+        <w:t xml:space="preserve">Figure </w:t>
+      </w:r>
+      <w:r>
+        <w:fldChar w:fldCharType="begin"/>
+      </w:r>
+      <w:r>
+        <w:instrText xml:space="preserve"> STYLEREF 1 \s </w:instrText>
+      </w:r>
+      <w:r>
+        <w:fldChar w:fldCharType="separate"/>
+      </w:r>
+      <w:r>
+        <w:rPr>
+          <w:noProof/>
+        </w:rPr>
+        <w:t>0</w:t>
+      </w:r>
+      <w:r>
+        <w:fldChar w:fldCharType="end"/>
+      </w:r>
+      <w:r>
+        <w:noBreakHyphen/>
+      </w:r>
+      <w:r>
+        <w:fldChar w:fldCharType="begin"/>
+      </w:r>
+      <w:r>
+        <w:instrText xml:space="preserve"> SEQ Figure \* ARABIC \s 1 </w:instrText>
+      </w:r>
+      <w:r>
+        <w:fldChar w:fldCharType="separate"/>
+      </w:r>
+      <w:r>
+        <w:rPr>
+          <w:noProof/>
+        </w:rPr>
+        <w:t>3</w:t>
+      </w:r>
+      <w:r>
+        <w:fldChar w:fldCharType="end"/>
+      </w:r>
+      <w:r>
+        <w:t>:Script tha</w:t>
+      </w:r>
+      <w:r>
+        <w:t>t directs user to dashboard or index according to Role</w:t>
+      </w:r>
+    </w:p>
+    <w:p>
+      <w:pPr>
+        <w:pStyle w:val="Heading1"/>
+      </w:pPr>
+      <w:r>
+        <w:rPr>
+          <w:rFonts w:ascii="Times New Roman" w:hAnsi="Times New Roman" w:cs="Times New Roman"/>
+          <w:b/>
+          <w:color w:val="000000" w:themeColor="text1"/>
+          <w:sz w:val="52"/>
+          <w:szCs w:val="52"/>
+        </w:rPr>
+        <w:drawing>
+          <wp:inline distT="0" distB="0" distL="0" distR="0" wp14:anchorId="4E165731" wp14:editId="1B39BF3B">
+            <wp:extent cx="5790840" cy="3186819"/>
+            <wp:effectExtent l="0" t="0" r="635" b="0"/>
+            <wp:docPr id="38" name="Picture 38"/>
+            <wp:cNvGraphicFramePr>
+              <a:graphicFrameLocks xmlns:a="http://schemas.openxmlformats.org/drawingml/2006/main" noChangeAspect="1"/>
+            </wp:cNvGraphicFramePr>
+            <a:graphic xmlns:a="http://schemas.openxmlformats.org/drawingml/2006/main">
+              <a:graphicData uri="http://schemas.openxmlformats.org/drawingml/2006/picture">
+                <pic:pic xmlns:pic="http://schemas.openxmlformats.org/drawingml/2006/picture">
+                  <pic:nvPicPr>
+                    <pic:cNvPr id="1" name=""/>
+                    <pic:cNvPicPr/>
+                  </pic:nvPicPr>
+                  <pic:blipFill>
+                    <a:blip r:embed="rId60"/>
+                    <a:stretch>
+                      <a:fillRect/>
+                    </a:stretch>
+                  </pic:blipFill>
+                  <pic:spPr>
+                    <a:xfrm>
+                      <a:off x="0" y="0"/>
+                      <a:ext cx="5810545" cy="3197663"/>
+                    </a:xfrm>
+                    <a:prstGeom prst="rect">
+                      <a:avLst/>
+                    </a:prstGeom>
+                  </pic:spPr>
+                </pic:pic>
+              </a:graphicData>
+            </a:graphic>
+          </wp:inline>
+        </w:drawing>
+      </w:r>
+    </w:p>
+    <w:p>
+      <w:pPr>
+        <w:pStyle w:val="Caption"/>
+      </w:pPr>
+      <w:r>
+        <w:t xml:space="preserve">Figure </w:t>
+      </w:r>
+      <w:r>
+        <w:fldChar w:fldCharType="begin"/>
+      </w:r>
+      <w:r>
+        <w:instrText xml:space="preserve"> STYLEREF 1 \s </w:instrText>
+      </w:r>
+      <w:r>
+        <w:fldChar w:fldCharType="separate"/>
+      </w:r>
+      <w:r>
+        <w:rPr>
+          <w:noProof/>
+        </w:rPr>
+        <w:t>0</w:t>
+      </w:r>
+      <w:r>
+        <w:fldChar w:fldCharType="end"/>
+      </w:r>
+      <w:r>
+        <w:noBreakHyphen/>
+      </w:r>
+      <w:r>
+        <w:fldChar w:fldCharType="begin"/>
+      </w:r>
+      <w:r>
+        <w:instrText xml:space="preserve"> SEQ Figure \* ARABIC \s 1 </w:instrText>
+      </w:r>
+      <w:r>
+        <w:fldChar w:fldCharType="separate"/>
+      </w:r>
+      <w:r>
+        <w:rPr>
+          <w:noProof/>
+        </w:rPr>
+        <w:t>1</w:t>
+      </w:r>
+      <w:r>
+        <w:fldChar w:fldCharType="end"/>
+      </w:r>
+      <w:r>
+        <w:t>:add new users form</w:t>
+      </w:r>
+    </w:p>
+    <w:p>
+      <w:pPr>
+        <w:keepNext/>
+      </w:pPr>
+      <w:r>
+        <w:drawing>
+          <wp:inline distT="0" distB="0" distL="0" distR="0" wp14:anchorId="2E034041" wp14:editId="2AFF737C">
+            <wp:extent cx="6084614" cy="2480650"/>
+            <wp:effectExtent l="0" t="0" r="0" b="0"/>
+            <wp:docPr id="41" name="Picture 41"/>
+            <wp:cNvGraphicFramePr>
+              <a:graphicFrameLocks xmlns:a="http://schemas.openxmlformats.org/drawingml/2006/main" noChangeAspect="1"/>
+            </wp:cNvGraphicFramePr>
+            <a:graphic xmlns:a="http://schemas.openxmlformats.org/drawingml/2006/main">
+              <a:graphicData uri="http://schemas.openxmlformats.org/drawingml/2006/picture">
+                <pic:pic xmlns:pic="http://schemas.openxmlformats.org/drawingml/2006/picture">
+                  <pic:nvPicPr>
+                    <pic:cNvPr id="1" name=""/>
+                    <pic:cNvPicPr/>
+                  </pic:nvPicPr>
+                  <pic:blipFill>
+                    <a:blip r:embed="rId61"/>
+                    <a:stretch>
+                      <a:fillRect/>
+                    </a:stretch>
+                  </pic:blipFill>
+                  <pic:spPr>
+                    <a:xfrm>
+                      <a:off x="0" y="0"/>
+                      <a:ext cx="6144074" cy="2504891"/>
+                    </a:xfrm>
+                    <a:prstGeom prst="rect">
+                      <a:avLst/>
+                    </a:prstGeom>
+                  </pic:spPr>
+                </pic:pic>
+              </a:graphicData>
+            </a:graphic>
+          </wp:inline>
+        </w:drawing>
+      </w:r>
+    </w:p>
+    <w:p>
+      <w:pPr>
+        <w:pStyle w:val="Caption"/>
+      </w:pPr>
+      <w:r>
+        <w:t xml:space="preserve">Figure </w:t>
+      </w:r>
+      <w:r>
+        <w:fldChar w:fldCharType="begin"/>
+      </w:r>
+      <w:r>
+        <w:instrText xml:space="preserve"> STYLEREF 1 \s </w:instrText>
+      </w:r>
+      <w:r>
+        <w:fldChar w:fldCharType="separate"/>
+      </w:r>
+      <w:r>
+        <w:rPr>
+          <w:noProof/>
+        </w:rPr>
+        <w:t>0</w:t>
+      </w:r>
+      <w:r>
+        <w:fldChar w:fldCharType="end"/>
+      </w:r>
+      <w:r>
+        <w:noBreakHyphen/>
+      </w:r>
+      <w:r>
+        <w:fldChar w:fldCharType="begin"/>
+      </w:r>
+      <w:r>
+        <w:instrText xml:space="preserve"> SEQ Figure \* ARABIC \s 1 </w:instrText>
+      </w:r>
+      <w:r>
+        <w:fldChar w:fldCharType="separate"/>
+      </w:r>
+      <w:r>
+        <w:rPr>
+          <w:noProof/>
+        </w:rPr>
+        <w:t>2</w:t>
+      </w:r>
+      <w:r>
+        <w:fldChar w:fldCharType="end"/>
+      </w:r>
+      <w:r>
+        <w:t>;</w:t>
+      </w:r>
+      <w:r>
+        <w:t>Secure User Registration Module. In this B2B architecture, public registration is disabled; users are securely provisioned by the Administrator to ensure system integrity.</w:t>
+      </w:r>
+    </w:p>
+    <w:p>
+      <w:pPr>
+        <w:pStyle w:val="Heading1"/>
+      </w:pPr>
+      <w:r>
+        <w:rPr>
+          <w:rFonts w:ascii="Times New Roman" w:hAnsi="Times New Roman" w:cs="Times New Roman"/>
+          <w:b/>
+          <w:color w:val="000000" w:themeColor="text1"/>
+          <w:sz w:val="52"/>
+          <w:szCs w:val="52"/>
+        </w:rPr>
+        <w:lastRenderedPageBreak/>
+        <w:drawing>
+          <wp:inline distT="0" distB="0" distL="0" distR="0" wp14:anchorId="79168836" wp14:editId="026F39BD">
+            <wp:extent cx="5943600" cy="584835"/>
+            <wp:effectExtent l="0" t="0" r="0" b="5715"/>
+            <wp:docPr id="57" name="Picture 57"/>
+            <wp:cNvGraphicFramePr>
+              <a:graphicFrameLocks xmlns:a="http://schemas.openxmlformats.org/drawingml/2006/main" noChangeAspect="1"/>
+            </wp:cNvGraphicFramePr>
+            <a:graphic xmlns:a="http://schemas.openxmlformats.org/drawingml/2006/main">
+              <a:graphicData uri="http://schemas.openxmlformats.org/drawingml/2006/picture">
+                <pic:pic xmlns:pic="http://schemas.openxmlformats.org/drawingml/2006/picture">
+                  <pic:nvPicPr>
+                    <pic:cNvPr id="1" name=""/>
+                    <pic:cNvPicPr/>
+                  </pic:nvPicPr>
+                  <pic:blipFill>
+                    <a:blip r:embed="rId62"/>
+                    <a:stretch>
+                      <a:fillRect/>
+                    </a:stretch>
+                  </pic:blipFill>
+                  <pic:spPr>
+                    <a:xfrm>
+                      <a:off x="0" y="0"/>
+                      <a:ext cx="5943600" cy="584835"/>
+                    </a:xfrm>
+                    <a:prstGeom prst="rect">
+                      <a:avLst/>
+                    </a:prstGeom>
+                  </pic:spPr>
+                </pic:pic>
+              </a:graphicData>
+            </a:graphic>
+          </wp:inline>
+        </w:drawing>
+      </w:r>
+    </w:p>
+    <w:p>
+      <w:pPr>
+        <w:pStyle w:val="Caption"/>
+        <w:keepNext/>
+      </w:pPr>
+      <w:r>
+        <w:t xml:space="preserve">Figure </w:t>
+      </w:r>
+      <w:r>
+        <w:fldChar w:fldCharType="begin"/>
+      </w:r>
+      <w:r>
+        <w:instrText xml:space="preserve"> STYLEREF 1 \s </w:instrText>
+      </w:r>
+      <w:r>
+        <w:fldChar w:fldCharType="separate"/>
+      </w:r>
+      <w:r>
+        <w:rPr>
+          <w:noProof/>
+        </w:rPr>
+        <w:t>0</w:t>
+      </w:r>
+      <w:r>
+        <w:fldChar w:fldCharType="end"/>
+      </w:r>
+      <w:r>
+        <w:noBreakHyphen/>
+      </w:r>
+      <w:r>
+        <w:fldChar w:fldCharType="begin"/>
+      </w:r>
+      <w:r>
+        <w:instrText xml:space="preserve"> SEQ Figure \* ARABIC \s 1 </w:instrText>
+      </w:r>
+      <w:r>
+        <w:fldChar w:fldCharType="separate"/>
+      </w:r>
+      <w:r>
+        <w:rPr>
+          <w:noProof/>
+        </w:rPr>
+        <w:t>1</w:t>
+      </w:r>
+      <w:r>
+        <w:fldChar w:fldCharType="end"/>
+      </w:r>
+      <w:r>
+        <w:t xml:space="preserve">: </w:t>
+      </w:r>
+      <w:r>
+        <w:t xml:space="preserve">Cryptographic Password Hashing. Proof of PHP's native </w:t>
+      </w:r>
+      <w:r>
+        <w:rPr>
+          <w:color w:val="FF0000"/>
+        </w:rPr>
+        <w:t xml:space="preserve">password_hash() </w:t>
+      </w:r>
+      <w:r>
+        <w:t>implementation. Passwords are never stored in plain text, mitigating the risk of database breaches.</w:t>
+      </w:r>
+    </w:p>
+    <w:p>
+      <w:pPr>
+        <w:pStyle w:val="Caption"/>
+        <w:keepNext/>
+      </w:pPr>
+      <w:r>
+        <w:br/>
+      </w:r>
+      <w:r>
+        <w:drawing>
+          <wp:inline distT="0" distB="0" distL="0" distR="0" wp14:anchorId="456711FB" wp14:editId="695C2709">
+            <wp:extent cx="4716855" cy="2658774"/>
+            <wp:effectExtent l="0" t="0" r="7620" b="8255"/>
+            <wp:docPr id="58" name="Picture 58"/>
+            <wp:cNvGraphicFramePr>
+              <a:graphicFrameLocks xmlns:a="http://schemas.openxmlformats.org/drawingml/2006/main" noChangeAspect="1"/>
+            </wp:cNvGraphicFramePr>
+            <a:graphic xmlns:a="http://schemas.openxmlformats.org/drawingml/2006/main">
+              <a:graphicData uri="http://schemas.openxmlformats.org/drawingml/2006/picture">
+                <pic:pic xmlns:pic="http://schemas.openxmlformats.org/drawingml/2006/picture">
+                  <pic:nvPicPr>
+                    <pic:cNvPr id="1" name=""/>
+                    <pic:cNvPicPr/>
+                  </pic:nvPicPr>
+                  <pic:blipFill>
+                    <a:blip r:embed="rId63"/>
+                    <a:stretch>
+                      <a:fillRect/>
+                    </a:stretch>
+                  </pic:blipFill>
+                  <pic:spPr>
+                    <a:xfrm>
+                      <a:off x="0" y="0"/>
+                      <a:ext cx="4723841" cy="2662712"/>
+                    </a:xfrm>
+                    <a:prstGeom prst="rect">
+                      <a:avLst/>
+                    </a:prstGeom>
+                  </pic:spPr>
+                </pic:pic>
+              </a:graphicData>
+            </a:graphic>
+          </wp:inline>
+        </w:drawing>
+      </w:r>
+    </w:p>
+    <w:p>
+      <w:pPr>
+        <w:pStyle w:val="Caption"/>
+      </w:pPr>
+      <w:r>
+        <w:t xml:space="preserve">Figure </w:t>
+      </w:r>
+      <w:r>
+        <w:fldChar w:fldCharType="begin"/>
+      </w:r>
+      <w:r>
+        <w:instrText xml:space="preserve"> STYLEREF 1 \s </w:instrText>
+      </w:r>
+      <w:r>
+        <w:fldChar w:fldCharType="separate"/>
+      </w:r>
+      <w:r>
+        <w:rPr>
+          <w:noProof/>
+        </w:rPr>
+        <w:t>0</w:t>
+      </w:r>
+      <w:r>
+        <w:fldChar w:fldCharType="end"/>
+      </w:r>
+      <w:r>
+        <w:noBreakHyphen/>
+      </w:r>
+      <w:r>
+        <w:fldChar w:fldCharType="begin"/>
+      </w:r>
+      <w:r>
+        <w:instrText xml:space="preserve"> SEQ Figure \* ARABIC \s 1 </w:instrText>
+      </w:r>
+      <w:r>
+        <w:fldChar w:fldCharType="separate"/>
+      </w:r>
+      <w:r>
+        <w:rPr>
+          <w:noProof/>
+        </w:rPr>
+        <w:t>2</w:t>
+      </w:r>
+      <w:r>
+        <w:fldChar w:fldCharType="end"/>
+      </w:r>
+      <w:r>
+        <w:t>; register_user_form.php file -  script of the password_hash implementation</w:t>
+      </w:r>
+    </w:p>
+    <w:p/>
+    <w:p>
+      <w:pPr>
+        <w:keepNext/>
+      </w:pPr>
+      <w:r>
+        <w:drawing>
+          <wp:inline distT="0" distB="0" distL="0" distR="0" wp14:anchorId="63E70EE3" wp14:editId="6D2B9C50">
+            <wp:extent cx="4781118" cy="2000816"/>
+            <wp:effectExtent l="0" t="0" r="635" b="0"/>
+            <wp:docPr id="59" name="Picture 59"/>
+            <wp:cNvGraphicFramePr>
+              <a:graphicFrameLocks xmlns:a="http://schemas.openxmlformats.org/drawingml/2006/main" noChangeAspect="1"/>
+            </wp:cNvGraphicFramePr>
+            <a:graphic xmlns:a="http://schemas.openxmlformats.org/drawingml/2006/main">
+              <a:graphicData uri="http://schemas.openxmlformats.org/drawingml/2006/picture">
+                <pic:pic xmlns:pic="http://schemas.openxmlformats.org/drawingml/2006/picture">
+                  <pic:nvPicPr>
+                    <pic:cNvPr id="1" name=""/>
+                    <pic:cNvPicPr/>
+                  </pic:nvPicPr>
+                  <pic:blipFill>
+                    <a:blip r:embed="rId64"/>
+                    <a:stretch>
+                      <a:fillRect/>
+                    </a:stretch>
+                  </pic:blipFill>
+                  <pic:spPr>
+                    <a:xfrm>
+                      <a:off x="0" y="0"/>
+                      <a:ext cx="4790182" cy="2004609"/>
+                    </a:xfrm>
+                    <a:prstGeom prst="rect">
+                      <a:avLst/>
+                    </a:prstGeom>
+                  </pic:spPr>
+                </pic:pic>
+              </a:graphicData>
+            </a:graphic>
+          </wp:inline>
+        </w:drawing>
+      </w:r>
+    </w:p>
+    <w:p>
+      <w:pPr>
+        <w:pStyle w:val="Caption"/>
+      </w:pPr>
+      <w:r>
+        <w:t xml:space="preserve">Figure </w:t>
+      </w:r>
+      <w:r>
+        <w:fldChar w:fldCharType="begin"/>
+      </w:r>
+      <w:r>
+        <w:instrText xml:space="preserve"> STYLEREF 1 \s </w:instrText>
+      </w:r>
+      <w:r>
+        <w:fldChar w:fldCharType="separate"/>
+      </w:r>
+      <w:r>
+        <w:rPr>
+          <w:noProof/>
+        </w:rPr>
+        <w:t>0</w:t>
+      </w:r>
+      <w:r>
+        <w:fldChar w:fldCharType="end"/>
+      </w:r>
+      <w:r>
+        <w:noBreakHyphen/>
+      </w:r>
+      <w:r>
+        <w:fldChar w:fldCharType="begin"/>
+      </w:r>
+      <w:r>
+        <w:instrText xml:space="preserve"> SEQ Figure \* ARABIC \s 1 </w:instrText>
+      </w:r>
+      <w:r>
+        <w:fldChar w:fldCharType="separate"/>
+      </w:r>
+      <w:r>
+        <w:rPr>
+          <w:noProof/>
+        </w:rPr>
+        <w:t>3</w:t>
+      </w:r>
+      <w:r>
+        <w:fldChar w:fldCharType="end"/>
+      </w:r>
+      <w:r>
+        <w:t xml:space="preserve">; </w:t>
+      </w:r>
+      <w:r>
+        <w:rPr>
+          <w:color w:val="FF0000"/>
+        </w:rPr>
+        <w:t>requireLogin('')</w:t>
+      </w:r>
+      <w:r>
+        <w:t>Restricts acces of register_users_form.php to only Admins</w:t>
+      </w:r>
+    </w:p>
+    <w:p>
+      <w:pPr>
+        <w:pStyle w:val="Caption"/>
+        <w:rPr>
+          <w:rFonts w:ascii="Times New Roman" w:eastAsia="Times New Roman" w:hAnsi="Times New Roman" w:cs="Times New Roman"/>
+          <w:b/>
+          <w:bCs/>
+          <w:color w:val="auto"/>
+          <w:kern w:val="36"/>
+          <w:sz w:val="36"/>
+          <w:szCs w:val="36"/>
+          <w:u w:val="single"/>
+        </w:rPr>
+      </w:pPr>
+      <w:r>
+        <w:br/>
+      </w:r>
+    </w:p>
+    <w:p>
+      <w:pPr>
+        <w:pStyle w:val="Heading1"/>
+      </w:pPr>
+      <w:r>
+        <w:rPr>
+          <w:rFonts w:ascii="Times New Roman" w:hAnsi="Times New Roman" w:cs="Times New Roman"/>
+          <w:b/>
+          <w:color w:val="000000" w:themeColor="text1"/>
+          <w:sz w:val="52"/>
+          <w:szCs w:val="52"/>
+        </w:rPr>
+        <w:lastRenderedPageBreak/>
+        <w:br/>
+      </w:r>
+      <w:r>
+        <w:rPr>
+          <w:rFonts w:ascii="Times New Roman" w:hAnsi="Times New Roman" w:cs="Times New Roman"/>
+          <w:b/>
+          <w:noProof/>
+          <w:color w:val="000000" w:themeColor="text1"/>
+          <w:sz w:val="52"/>
+          <w:szCs w:val="52"/>
+        </w:rPr>
+        <w:drawing>
+          <wp:inline distT="0" distB="0" distL="0" distR="0" wp14:anchorId="1470E269" wp14:editId="00A76426">
+            <wp:extent cx="5277587" cy="2086266"/>
+            <wp:effectExtent l="0" t="0" r="0" b="9525"/>
+            <wp:docPr id="39" name="Picture 39"/>
+            <wp:cNvGraphicFramePr>
+              <a:graphicFrameLocks xmlns:a="http://schemas.openxmlformats.org/drawingml/2006/main" noChangeAspect="1"/>
+            </wp:cNvGraphicFramePr>
+            <a:graphic xmlns:a="http://schemas.openxmlformats.org/drawingml/2006/main">
+              <a:graphicData uri="http://schemas.openxmlformats.org/drawingml/2006/picture">
+                <pic:pic xmlns:pic="http://schemas.openxmlformats.org/drawingml/2006/picture">
+                  <pic:nvPicPr>
+                    <pic:cNvPr id="1" name=""/>
+                    <pic:cNvPicPr/>
+                  </pic:nvPicPr>
+                  <pic:blipFill>
+                    <a:blip r:embed="rId65"/>
+                    <a:stretch>
+                      <a:fillRect/>
+                    </a:stretch>
+                  </pic:blipFill>
+                  <pic:spPr>
+                    <a:xfrm>
+                      <a:off x="0" y="0"/>
                       <a:ext cx="5277587" cy="2086266"/>
                     </a:xfrm>
                     <a:prstGeom prst="rect">
@@ -11827,30 +12962,506 @@
     </w:p>
     <w:p>
       <w:pPr>
-        <w:rPr>
-          <w:rFonts w:ascii="Times New Roman" w:hAnsi="Times New Roman" w:cs="Times New Roman"/>
-        </w:rPr>
-      </w:pPr>
-      <w:r>
-        <w:rPr>
-          <w:rFonts w:ascii="Times New Roman" w:hAnsi="Times New Roman" w:cs="Times New Roman"/>
-        </w:rPr>
-        <w:t>Screenshot to show To use The Manager Index.php page, it requires Log in, Managerial credentials</w:t>
-      </w:r>
-      <w:r>
-        <w:rPr>
-          <w:rFonts w:ascii="Times New Roman" w:hAnsi="Times New Roman" w:cs="Times New Roman"/>
-        </w:rPr>
-        <w:t>.</w:t>
-      </w:r>
+        <w:pStyle w:val="Caption"/>
+        <w:rPr>
+          <w:rFonts w:ascii="Times New Roman" w:eastAsia="Times New Roman" w:hAnsi="Times New Roman" w:cs="Times New Roman"/>
+          <w:b/>
+          <w:bCs/>
+          <w:color w:val="auto"/>
+          <w:kern w:val="36"/>
+          <w:sz w:val="36"/>
+          <w:szCs w:val="36"/>
+          <w:u w:val="single"/>
+        </w:rPr>
+      </w:pPr>
+      <w:r>
+        <w:t xml:space="preserve">Figure </w:t>
+      </w:r>
+      <w:r>
+        <w:fldChar w:fldCharType="begin"/>
+      </w:r>
+      <w:r>
+        <w:instrText xml:space="preserve"> STYLEREF 1 \s </w:instrText>
+      </w:r>
+      <w:r>
+        <w:fldChar w:fldCharType="separate"/>
+      </w:r>
+      <w:r>
+        <w:rPr>
+          <w:noProof/>
+        </w:rPr>
+        <w:t>0</w:t>
+      </w:r>
+      <w:r>
+        <w:fldChar w:fldCharType="end"/>
+      </w:r>
+      <w:r>
+        <w:noBreakHyphen/>
+      </w:r>
+      <w:r>
+        <w:fldChar w:fldCharType="begin"/>
+      </w:r>
+      <w:r>
+        <w:instrText xml:space="preserve"> SEQ Figure \* ARABIC \s 1 </w:instrText>
+      </w:r>
+      <w:r>
+        <w:fldChar w:fldCharType="separate"/>
+      </w:r>
+      <w:r>
+        <w:rPr>
+          <w:noProof/>
+        </w:rPr>
+        <w:t>1</w:t>
+      </w:r>
+      <w:r>
+        <w:fldChar w:fldCharType="end"/>
+      </w:r>
+      <w:r>
+        <w:t>:</w:t>
+      </w:r>
+      <w:r>
+        <w:t>The Header (Cache-Control), is HTTP that instructs the browser not to Cache the page. To always validate the</w:t>
+      </w:r>
+      <w:r>
+        <w:t xml:space="preserve"> page, every time a user log in</w:t>
+      </w:r>
+    </w:p>
+    <w:p>
+      <w:pPr>
+        <w:rPr>
+          <w:rFonts w:ascii="Times New Roman" w:hAnsi="Times New Roman" w:cs="Times New Roman"/>
+        </w:rPr>
+      </w:pPr>
       <w:r>
         <w:rPr>
           <w:rFonts w:ascii="Times New Roman" w:hAnsi="Times New Roman" w:cs="Times New Roman"/>
         </w:rPr>
         <w:br/>
-        <w:t xml:space="preserve">The Header (Cache-Control), is HTTP that instructs the browser not to Cache the page. To always validate the page, every time a user log is </w:t>
-      </w:r>
-    </w:p>
+      </w:r>
+    </w:p>
+    <w:p>
+      <w:pPr>
+        <w:keepNext/>
+      </w:pPr>
+      <w:r>
+        <w:rPr>
+          <w:rFonts w:ascii="Times New Roman" w:hAnsi="Times New Roman" w:cs="Times New Roman"/>
+        </w:rPr>
+        <w:drawing>
+          <wp:inline distT="0" distB="0" distL="0" distR="0" wp14:anchorId="396E27C7" wp14:editId="70E5433E">
+            <wp:extent cx="5943600" cy="3730028"/>
+            <wp:effectExtent l="0" t="0" r="0" b="3810"/>
+            <wp:docPr id="29" name="Picture 29"/>
+            <wp:cNvGraphicFramePr>
+              <a:graphicFrameLocks xmlns:a="http://schemas.openxmlformats.org/drawingml/2006/main" noChangeAspect="1"/>
+            </wp:cNvGraphicFramePr>
+            <a:graphic xmlns:a="http://schemas.openxmlformats.org/drawingml/2006/main">
+              <a:graphicData uri="http://schemas.openxmlformats.org/drawingml/2006/picture">
+                <pic:pic xmlns:pic="http://schemas.openxmlformats.org/drawingml/2006/picture">
+                  <pic:nvPicPr>
+                    <pic:cNvPr id="1" name=""/>
+                    <pic:cNvPicPr/>
+                  </pic:nvPicPr>
+                  <pic:blipFill>
+                    <a:blip r:embed="rId66"/>
+                    <a:stretch>
+                      <a:fillRect/>
+                    </a:stretch>
+                  </pic:blipFill>
+                  <pic:spPr>
+                    <a:xfrm>
+                      <a:off x="0" y="0"/>
+                      <a:ext cx="5953666" cy="3736345"/>
+                    </a:xfrm>
+                    <a:prstGeom prst="rect">
+                      <a:avLst/>
+                    </a:prstGeom>
+                  </pic:spPr>
+                </pic:pic>
+              </a:graphicData>
+            </a:graphic>
+          </wp:inline>
+        </w:drawing>
+      </w:r>
+    </w:p>
+    <w:p>
+      <w:pPr>
+        <w:pStyle w:val="Caption"/>
+      </w:pPr>
+      <w:r>
+        <w:t xml:space="preserve">Figure </w:t>
+      </w:r>
+      <w:r>
+        <w:fldChar w:fldCharType="begin"/>
+      </w:r>
+      <w:r>
+        <w:instrText xml:space="preserve"> STYLEREF 1 \s </w:instrText>
+      </w:r>
+      <w:r>
+        <w:fldChar w:fldCharType="separate"/>
+      </w:r>
+      <w:r>
+        <w:rPr>
+          <w:noProof/>
+        </w:rPr>
+        <w:t>0</w:t>
+      </w:r>
+      <w:r>
+        <w:fldChar w:fldCharType="end"/>
+      </w:r>
+      <w:r>
+        <w:noBreakHyphen/>
+      </w:r>
+      <w:r>
+        <w:fldChar w:fldCharType="begin"/>
+      </w:r>
+      <w:r>
+        <w:instrText xml:space="preserve"> SEQ Figure \* ARABIC \s 1 </w:instrText>
+      </w:r>
+      <w:r>
+        <w:fldChar w:fldCharType="separate"/>
+      </w:r>
+      <w:r>
+        <w:rPr>
+          <w:noProof/>
+        </w:rPr>
+        <w:t>2</w:t>
+      </w:r>
+      <w:r>
+        <w:fldChar w:fldCharType="end"/>
+      </w:r>
+      <w:r>
+        <w:t>;</w:t>
+      </w:r>
+      <w:r>
+        <w:t>Backend logic demonstrating the initialization of secure session variables upon successful cryptographic password verification.</w:t>
+      </w:r>
+    </w:p>
+    <w:p>
+      <w:pPr>
+        <w:keepNext/>
+      </w:pPr>
+      <w:r>
+        <w:lastRenderedPageBreak/>
+        <w:drawing>
+          <wp:inline distT="0" distB="0" distL="0" distR="0" wp14:anchorId="1FD9A7F9" wp14:editId="00593900">
+            <wp:extent cx="4807390" cy="2832559"/>
+            <wp:effectExtent l="0" t="0" r="0" b="6350"/>
+            <wp:docPr id="60" name="Picture 60"/>
+            <wp:cNvGraphicFramePr>
+              <a:graphicFrameLocks xmlns:a="http://schemas.openxmlformats.org/drawingml/2006/main" noChangeAspect="1"/>
+            </wp:cNvGraphicFramePr>
+            <a:graphic xmlns:a="http://schemas.openxmlformats.org/drawingml/2006/main">
+              <a:graphicData uri="http://schemas.openxmlformats.org/drawingml/2006/picture">
+                <pic:pic xmlns:pic="http://schemas.openxmlformats.org/drawingml/2006/picture">
+                  <pic:nvPicPr>
+                    <pic:cNvPr id="1" name=""/>
+                    <pic:cNvPicPr/>
+                  </pic:nvPicPr>
+                  <pic:blipFill>
+                    <a:blip r:embed="rId67"/>
+                    <a:stretch>
+                      <a:fillRect/>
+                    </a:stretch>
+                  </pic:blipFill>
+                  <pic:spPr>
+                    <a:xfrm>
+                      <a:off x="0" y="0"/>
+                      <a:ext cx="4816348" cy="2837837"/>
+                    </a:xfrm>
+                    <a:prstGeom prst="rect">
+                      <a:avLst/>
+                    </a:prstGeom>
+                  </pic:spPr>
+                </pic:pic>
+              </a:graphicData>
+            </a:graphic>
+          </wp:inline>
+        </w:drawing>
+      </w:r>
+    </w:p>
+    <w:p>
+      <w:pPr>
+        <w:pStyle w:val="Caption"/>
+      </w:pPr>
+      <w:r>
+        <w:t xml:space="preserve">Figure </w:t>
+      </w:r>
+      <w:r>
+        <w:fldChar w:fldCharType="begin"/>
+      </w:r>
+      <w:r>
+        <w:instrText xml:space="preserve"> STYLEREF 1 \s </w:instrText>
+      </w:r>
+      <w:r>
+        <w:fldChar w:fldCharType="separate"/>
+      </w:r>
+      <w:r>
+        <w:rPr>
+          <w:noProof/>
+        </w:rPr>
+        <w:t>0</w:t>
+      </w:r>
+      <w:r>
+        <w:fldChar w:fldCharType="end"/>
+      </w:r>
+      <w:r>
+        <w:noBreakHyphen/>
+      </w:r>
+      <w:r>
+        <w:fldChar w:fldCharType="begin"/>
+      </w:r>
+      <w:r>
+        <w:instrText xml:space="preserve"> SEQ Figure \* ARABIC \s 1 </w:instrText>
+      </w:r>
+      <w:r>
+        <w:fldChar w:fldCharType="separate"/>
+      </w:r>
+      <w:r>
+        <w:rPr>
+          <w:noProof/>
+        </w:rPr>
+        <w:t>3</w:t>
+      </w:r>
+      <w:r>
+        <w:fldChar w:fldCharType="end"/>
+      </w:r>
+      <w:r>
+        <w:t>;</w:t>
+      </w:r>
+      <w:r>
+        <w:t>Session Management and Route Protection. Unauthenticated users attempting to bypass the login screen are intercepted by auth_guard.php and redirected, proving active session validation.</w:t>
+      </w:r>
+    </w:p>
+    <w:p>
+      <w:pPr>
+        <w:keepNext/>
+      </w:pPr>
+      <w:r>
+        <w:drawing>
+          <wp:inline distT="0" distB="0" distL="0" distR="0" wp14:anchorId="0EA3BA12" wp14:editId="387AD34C">
+            <wp:extent cx="5208047" cy="3440316"/>
+            <wp:effectExtent l="0" t="0" r="0" b="8255"/>
+            <wp:docPr id="61" name="Picture 61"/>
+            <wp:cNvGraphicFramePr>
+              <a:graphicFrameLocks xmlns:a="http://schemas.openxmlformats.org/drawingml/2006/main" noChangeAspect="1"/>
+            </wp:cNvGraphicFramePr>
+            <a:graphic xmlns:a="http://schemas.openxmlformats.org/drawingml/2006/main">
+              <a:graphicData uri="http://schemas.openxmlformats.org/drawingml/2006/picture">
+                <pic:pic xmlns:pic="http://schemas.openxmlformats.org/drawingml/2006/picture">
+                  <pic:nvPicPr>
+                    <pic:cNvPr id="1" name=""/>
+                    <pic:cNvPicPr/>
+                  </pic:nvPicPr>
+                  <pic:blipFill>
+                    <a:blip r:embed="rId68"/>
+                    <a:stretch>
+                      <a:fillRect/>
+                    </a:stretch>
+                  </pic:blipFill>
+                  <pic:spPr>
+                    <a:xfrm>
+                      <a:off x="0" y="0"/>
+                      <a:ext cx="5219359" cy="3447788"/>
+                    </a:xfrm>
+                    <a:prstGeom prst="rect">
+                      <a:avLst/>
+                    </a:prstGeom>
+                  </pic:spPr>
+                </pic:pic>
+              </a:graphicData>
+            </a:graphic>
+          </wp:inline>
+        </w:drawing>
+      </w:r>
+    </w:p>
+    <w:p>
+      <w:pPr>
+        <w:pStyle w:val="Caption"/>
+      </w:pPr>
+      <w:r>
+        <w:t xml:space="preserve">Figure </w:t>
+      </w:r>
+      <w:r>
+        <w:fldChar w:fldCharType="begin"/>
+      </w:r>
+      <w:r>
+        <w:instrText xml:space="preserve"> STYLEREF 1 \s </w:instrText>
+      </w:r>
+      <w:r>
+        <w:fldChar w:fldCharType="separate"/>
+      </w:r>
+      <w:r>
+        <w:rPr>
+          <w:noProof/>
+        </w:rPr>
+        <w:t>0</w:t>
+      </w:r>
+      <w:r>
+        <w:fldChar w:fldCharType="end"/>
+      </w:r>
+      <w:r>
+        <w:noBreakHyphen/>
+      </w:r>
+      <w:r>
+        <w:fldChar w:fldCharType="begin"/>
+      </w:r>
+      <w:r>
+        <w:instrText xml:space="preserve"> SEQ Figure \* ARABIC \s 1 </w:instrText>
+      </w:r>
+      <w:r>
+        <w:fldChar w:fldCharType="separate"/>
+      </w:r>
+      <w:r>
+        <w:rPr>
+          <w:noProof/>
+        </w:rPr>
+        <w:t>4</w:t>
+      </w:r>
+      <w:r>
+        <w:fldChar w:fldCharType="end"/>
+      </w:r>
+      <w:r>
+        <w:t>:auth_guard.php- Session Management and Routing</w:t>
+      </w:r>
+    </w:p>
+    <w:p/>
+    <w:p>
+      <w:pPr>
+        <w:keepNext/>
+      </w:pPr>
+      <w:r>
+        <w:lastRenderedPageBreak/>
+        <w:drawing>
+          <wp:inline distT="0" distB="0" distL="0" distR="0" wp14:anchorId="1E2EF38E" wp14:editId="37FFE809">
+            <wp:extent cx="4843604" cy="2325163"/>
+            <wp:effectExtent l="0" t="0" r="0" b="0"/>
+            <wp:docPr id="63" name="Picture 63"/>
+            <wp:cNvGraphicFramePr>
+              <a:graphicFrameLocks xmlns:a="http://schemas.openxmlformats.org/drawingml/2006/main" noChangeAspect="1"/>
+            </wp:cNvGraphicFramePr>
+            <a:graphic xmlns:a="http://schemas.openxmlformats.org/drawingml/2006/main">
+              <a:graphicData uri="http://schemas.openxmlformats.org/drawingml/2006/picture">
+                <pic:pic xmlns:pic="http://schemas.openxmlformats.org/drawingml/2006/picture">
+                  <pic:nvPicPr>
+                    <pic:cNvPr id="1" name=""/>
+                    <pic:cNvPicPr/>
+                  </pic:nvPicPr>
+                  <pic:blipFill>
+                    <a:blip r:embed="rId69"/>
+                    <a:stretch>
+                      <a:fillRect/>
+                    </a:stretch>
+                  </pic:blipFill>
+                  <pic:spPr>
+                    <a:xfrm>
+                      <a:off x="0" y="0"/>
+                      <a:ext cx="4856493" cy="2331350"/>
+                    </a:xfrm>
+                    <a:prstGeom prst="rect">
+                      <a:avLst/>
+                    </a:prstGeom>
+                  </pic:spPr>
+                </pic:pic>
+              </a:graphicData>
+            </a:graphic>
+          </wp:inline>
+        </w:drawing>
+      </w:r>
+    </w:p>
+    <w:p>
+      <w:pPr>
+        <w:pStyle w:val="Caption"/>
+      </w:pPr>
+      <w:r>
+        <w:t xml:space="preserve">Figure </w:t>
+      </w:r>
+      <w:r>
+        <w:fldChar w:fldCharType="begin"/>
+      </w:r>
+      <w:r>
+        <w:instrText xml:space="preserve"> STYLEREF 1 \s </w:instrText>
+      </w:r>
+      <w:r>
+        <w:fldChar w:fldCharType="separate"/>
+      </w:r>
+      <w:r>
+        <w:rPr>
+          <w:noProof/>
+        </w:rPr>
+        <w:t>0</w:t>
+      </w:r>
+      <w:r>
+        <w:fldChar w:fldCharType="end"/>
+      </w:r>
+      <w:r>
+        <w:noBreakHyphen/>
+      </w:r>
+      <w:r>
+        <w:fldChar w:fldCharType="begin"/>
+      </w:r>
+      <w:r>
+        <w:instrText xml:space="preserve"> SEQ Figure \* ARABIC \s 1 </w:instrText>
+      </w:r>
+      <w:r>
+        <w:fldChar w:fldCharType="separate"/>
+      </w:r>
+      <w:r>
+        <w:rPr>
+          <w:noProof/>
+        </w:rPr>
+        <w:t>5</w:t>
+      </w:r>
+      <w:r>
+        <w:fldChar w:fldCharType="end"/>
+      </w:r>
+      <w:r>
+        <w:t>:auth_guard.php - Destroy session and log out user script when logout button is clicked</w:t>
+      </w:r>
+    </w:p>
+    <w:p>
+      <w:pPr>
+        <w:pStyle w:val="Heading2"/>
+        <w:rPr>
+          <w:b/>
+          <w:color w:val="auto"/>
+          <w:u w:val="single"/>
+        </w:rPr>
+      </w:pPr>
+      <w:r>
+        <w:rPr>
+          <w:b/>
+          <w:color w:val="auto"/>
+          <w:u w:val="single"/>
+        </w:rPr>
+        <w:t>REFLECTION</w:t>
+      </w:r>
+      <w:r>
+        <w:rPr>
+          <w:b/>
+          <w:color w:val="auto"/>
+          <w:u w:val="single"/>
+        </w:rPr>
+        <w:t xml:space="preserve">       </w:t>
+      </w:r>
+    </w:p>
+    <w:p>
+      <w:r>
+        <w:t>By implementing PHP session management and Role-Based Access Control (RBAC), I successfully isolated the Administrator and Branch Manager workflows. The most significant learning was integrating cryptographic security using native password hashing to defend against database breaches, ensuring no plain-text credentials are ever stored. Transitioning the registration system into an admin-only provisioning tool further reinforced real-world B2B security practices</w:t>
+      </w:r>
+      <w:r>
+        <w:t xml:space="preserve"> including Rule Of Thumb</w:t>
+      </w:r>
+      <w:bookmarkStart w:id="75" w:name="_GoBack"/>
+      <w:bookmarkEnd w:id="75"/>
+      <w:r>
+        <w:t xml:space="preserve"> for CRUD</w:t>
+      </w:r>
+      <w:r>
+        <w:t>, providing a solid foundation in secure backend architecture.</w:t>
+      </w:r>
+    </w:p>
+    <w:p/>
     <w:sectPr>
       <w:pgSz w:w="12240" w:h="15840"/>
       <w:pgMar w:top="1440" w:right="1440" w:bottom="1440" w:left="1440" w:header="720" w:footer="720" w:gutter="0"/>
@@ -13519,7 +15130,6 @@
   <w:style w:type="character" w:default="1" w:styleId="DefaultParagraphFont">
     <w:name w:val="Default Paragraph Font"/>
     <w:uiPriority w:val="1"/>
-    <w:semiHidden/>
     <w:unhideWhenUsed/>
   </w:style>
   <w:style w:type="table" w:default="1" w:styleId="TableNormal">
@@ -14024,7 +15634,7 @@
 </file>
 
 <file path=customXml/itemProps1.xml><?xml version="1.0" encoding="utf-8"?>
-<ds:datastoreItem xmlns:ds="http://schemas.openxmlformats.org/officeDocument/2006/customXml" ds:itemID="{49D212B8-798C-4887-AEF3-89CDF20EEDA9}">
+<ds:datastoreItem xmlns:ds="http://schemas.openxmlformats.org/officeDocument/2006/customXml" ds:itemID="{B90D9C6B-DF33-476E-951B-D1B21B156BC6}">
   <ds:schemaRefs>
     <ds:schemaRef ds:uri="http://schemas.openxmlformats.org/officeDocument/2006/bibliography"/>
   </ds:schemaRefs>

</xml_diff>

<commit_message>
Removed space between the number and text in file names
</commit_message>
<xml_diff>
--- a/Week7/LOGBOOK/Log Book.docx
+++ b/Week7/LOGBOOK/Log Book.docx
@@ -13420,6 +13420,241 @@
       </w:r>
     </w:p>
     <w:p>
+      <w:r>
+        <w:rPr>
+          <w:noProof/>
+        </w:rPr>
+        <mc:AlternateContent>
+          <mc:Choice Requires="wps">
+            <w:drawing>
+              <wp:anchor distT="0" distB="0" distL="114300" distR="114300" simplePos="0" relativeHeight="251661824" behindDoc="0" locked="0" layoutInCell="1" allowOverlap="1" wp14:anchorId="7794C776" wp14:editId="21B4E145">
+                <wp:simplePos x="0" y="0"/>
+                <wp:positionH relativeFrom="column">
+                  <wp:posOffset>0</wp:posOffset>
+                </wp:positionH>
+                <wp:positionV relativeFrom="paragraph">
+                  <wp:posOffset>2896235</wp:posOffset>
+                </wp:positionV>
+                <wp:extent cx="4462780" cy="635"/>
+                <wp:effectExtent l="0" t="0" r="0" b="0"/>
+                <wp:wrapSquare wrapText="bothSides"/>
+                <wp:docPr id="1364310529" name="Text Box 1364310529"/>
+                <wp:cNvGraphicFramePr/>
+                <a:graphic xmlns:a="http://schemas.openxmlformats.org/drawingml/2006/main">
+                  <a:graphicData uri="http://schemas.microsoft.com/office/word/2010/wordprocessingShape">
+                    <wps:wsp>
+                      <wps:cNvSpPr txBox="1"/>
+                      <wps:spPr>
+                        <a:xfrm>
+                          <a:off x="0" y="0"/>
+                          <a:ext cx="4462780" cy="635"/>
+                        </a:xfrm>
+                        <a:prstGeom prst="rect">
+                          <a:avLst/>
+                        </a:prstGeom>
+                        <a:solidFill>
+                          <a:prstClr val="white"/>
+                        </a:solidFill>
+                        <a:ln>
+                          <a:noFill/>
+                        </a:ln>
+                        <a:effectLst/>
+                      </wps:spPr>
+                      <wps:txbx>
+                        <w:txbxContent>
+                          <w:p>
+                            <w:pPr>
+                              <w:pStyle w:val="Caption"/>
+                            </w:pPr>
+                            <w:r>
+                              <w:t xml:space="preserve">Figure </w:t>
+                            </w:r>
+                            <w:r>
+                              <w:fldChar w:fldCharType="begin"/>
+                            </w:r>
+                            <w:r>
+                              <w:instrText xml:space="preserve"> STYLEREF 1 \s </w:instrText>
+                            </w:r>
+                            <w:r>
+                              <w:fldChar w:fldCharType="separate"/>
+                            </w:r>
+                            <w:r>
+                              <w:rPr>
+                                <w:noProof/>
+                              </w:rPr>
+                              <w:t>0</w:t>
+                            </w:r>
+                            <w:r>
+                              <w:fldChar w:fldCharType="end"/>
+                            </w:r>
+                            <w:r>
+                              <w:noBreakHyphen/>
+                            </w:r>
+                            <w:r>
+                              <w:fldChar w:fldCharType="begin"/>
+                            </w:r>
+                            <w:r>
+                              <w:instrText xml:space="preserve"> SEQ Figure \* ARABIC \s 1 </w:instrText>
+                            </w:r>
+                            <w:r>
+                              <w:fldChar w:fldCharType="separate"/>
+                            </w:r>
+                            <w:r>
+                              <w:rPr>
+                                <w:noProof/>
+                              </w:rPr>
+                              <w:t>6</w:t>
+                            </w:r>
+                            <w:r>
+                              <w:fldChar w:fldCharType="end"/>
+                            </w:r>
+                            <w:r>
+                              <w:t>: Acess to index.php denied with an Admin Role session without going through login page.</w:t>
+                            </w:r>
+                            <w:r>
+                              <w:t>Script in Figre0-4, (//logged in, wrong Role )</w:t>
+                            </w:r>
+                          </w:p>
+                          <w:p/>
+                        </w:txbxContent>
+                      </wps:txbx>
+                      <wps:bodyPr rot="0" spcFirstLastPara="0" vertOverflow="overflow" horzOverflow="overflow" vert="horz" wrap="square" lIns="0" tIns="0" rIns="0" bIns="0" numCol="1" spcCol="0" rtlCol="0" fromWordArt="0" anchor="t" anchorCtr="0" forceAA="0" compatLnSpc="1">
+                        <a:prstTxWarp prst="textNoShape">
+                          <a:avLst/>
+                        </a:prstTxWarp>
+                        <a:spAutoFit/>
+                      </wps:bodyPr>
+                    </wps:wsp>
+                  </a:graphicData>
+                </a:graphic>
+              </wp:anchor>
+            </w:drawing>
+          </mc:Choice>
+          <mc:Fallback>
+            <w:pict>
+              <v:shape w14:anchorId="7794C776" id="Text Box 1364310529" o:spid="_x0000_s1028" type="#_x0000_t202" style="position:absolute;margin-left:0;margin-top:228.05pt;width:351.4pt;height:.05pt;z-index:251661824;visibility:visible;mso-wrap-style:square;mso-wrap-distance-left:9pt;mso-wrap-distance-top:0;mso-wrap-distance-right:9pt;mso-wrap-distance-bottom:0;mso-position-horizontal:absolute;mso-position-horizontal-relative:text;mso-position-vertical:absolute;mso-position-vertical-relative:text;v-text-anchor:top" o:gfxdata="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" stroked="f">
+                <v:textbox style="mso-fit-shape-to-text:t" inset="0,0,0,0">
+                  <w:txbxContent>
+                    <w:p>
+                      <w:pPr>
+                        <w:pStyle w:val="Caption"/>
+                      </w:pPr>
+                      <w:r>
+                        <w:t xml:space="preserve">Figure </w:t>
+                      </w:r>
+                      <w:r>
+                        <w:fldChar w:fldCharType="begin"/>
+                      </w:r>
+                      <w:r>
+                        <w:instrText xml:space="preserve"> STYLEREF 1 \s </w:instrText>
+                      </w:r>
+                      <w:r>
+                        <w:fldChar w:fldCharType="separate"/>
+                      </w:r>
+                      <w:r>
+                        <w:rPr>
+                          <w:noProof/>
+                        </w:rPr>
+                        <w:t>0</w:t>
+                      </w:r>
+                      <w:r>
+                        <w:fldChar w:fldCharType="end"/>
+                      </w:r>
+                      <w:r>
+                        <w:noBreakHyphen/>
+                      </w:r>
+                      <w:r>
+                        <w:fldChar w:fldCharType="begin"/>
+                      </w:r>
+                      <w:r>
+                        <w:instrText xml:space="preserve"> SEQ Figure \* ARABIC \s 1 </w:instrText>
+                      </w:r>
+                      <w:r>
+                        <w:fldChar w:fldCharType="separate"/>
+                      </w:r>
+                      <w:r>
+                        <w:rPr>
+                          <w:noProof/>
+                        </w:rPr>
+                        <w:t>6</w:t>
+                      </w:r>
+                      <w:r>
+                        <w:fldChar w:fldCharType="end"/>
+                      </w:r>
+                      <w:r>
+                        <w:t>: Acess to index.php denied with an Admin Role session without going through login page.</w:t>
+                      </w:r>
+                      <w:r>
+                        <w:t>Script in Figre0-4, (//logged in, wrong Role )</w:t>
+                      </w:r>
+                    </w:p>
+                    <w:p/>
+                  </w:txbxContent>
+                </v:textbox>
+                <w10:wrap type="square"/>
+              </v:shape>
+            </w:pict>
+          </mc:Fallback>
+        </mc:AlternateContent>
+      </w:r>
+      <w:r>
+        <w:drawing>
+          <wp:anchor distT="0" distB="0" distL="114300" distR="114300" simplePos="0" relativeHeight="251659776" behindDoc="0" locked="0" layoutInCell="1" allowOverlap="1">
+            <wp:simplePos x="914400" y="3621386"/>
+            <wp:positionH relativeFrom="column">
+              <wp:align>left</wp:align>
+            </wp:positionH>
+            <wp:positionV relativeFrom="paragraph">
+              <wp:align>top</wp:align>
+            </wp:positionV>
+            <wp:extent cx="4463358" cy="2839192"/>
+            <wp:effectExtent l="0" t="0" r="0" b="0"/>
+            <wp:wrapSquare wrapText="bothSides"/>
+            <wp:docPr id="1364310528" name="Picture 1364310528"/>
+            <wp:cNvGraphicFramePr>
+              <a:graphicFrameLocks xmlns:a="http://schemas.openxmlformats.org/drawingml/2006/main" noChangeAspect="1"/>
+            </wp:cNvGraphicFramePr>
+            <a:graphic xmlns:a="http://schemas.openxmlformats.org/drawingml/2006/main">
+              <a:graphicData uri="http://schemas.openxmlformats.org/drawingml/2006/picture">
+                <pic:pic xmlns:pic="http://schemas.openxmlformats.org/drawingml/2006/picture">
+                  <pic:nvPicPr>
+                    <pic:cNvPr id="1" name=""/>
+                    <pic:cNvPicPr/>
+                  </pic:nvPicPr>
+                  <pic:blipFill>
+                    <a:blip r:embed="rId70">
+                      <a:extLst>
+                        <a:ext uri="{28A0092B-C50C-407E-A947-70E740481C1C}">
+                          <a14:useLocalDpi xmlns:a14="http://schemas.microsoft.com/office/drawing/2010/main" val="0"/>
+                        </a:ext>
+                      </a:extLst>
+                    </a:blip>
+                    <a:stretch>
+                      <a:fillRect/>
+                    </a:stretch>
+                  </pic:blipFill>
+                  <pic:spPr>
+                    <a:xfrm>
+                      <a:off x="0" y="0"/>
+                      <a:ext cx="4463358" cy="2839192"/>
+                    </a:xfrm>
+                    <a:prstGeom prst="rect">
+                      <a:avLst/>
+                    </a:prstGeom>
+                  </pic:spPr>
+                </pic:pic>
+              </a:graphicData>
+            </a:graphic>
+          </wp:anchor>
+        </w:drawing>
+      </w:r>
+      <w:bookmarkStart w:id="75" w:name="_GoBack"/>
+      <w:bookmarkEnd w:id="75"/>
+      <w:r>
+        <w:br w:type="textWrapping" w:clear="all"/>
+      </w:r>
+    </w:p>
+    <w:p>
       <w:pPr>
         <w:pStyle w:val="Heading2"/>
         <w:rPr>
@@ -13450,18 +13685,52 @@
         <w:t>By implementing PHP session management and Role-Based Access Control (RBAC), I successfully isolated the Administrator and Branch Manager workflows. The most significant learning was integrating cryptographic security using native password hashing to defend against database breaches, ensuring no plain-text credentials are ever stored. Transitioning the registration system into an admin-only provisioning tool further reinforced real-world B2B security practices</w:t>
       </w:r>
       <w:r>
-        <w:t xml:space="preserve"> including Rule Of Thumb</w:t>
-      </w:r>
-      <w:bookmarkStart w:id="75" w:name="_GoBack"/>
-      <w:bookmarkEnd w:id="75"/>
-      <w:r>
-        <w:t xml:space="preserve"> for CRUD</w:t>
+        <w:t xml:space="preserve"> including Rule Of Thumb for CRUD</w:t>
       </w:r>
       <w:r>
         <w:t>, providing a solid foundation in secure backend architecture.</w:t>
       </w:r>
     </w:p>
-    <w:p/>
+    <w:p>
+      <w:pPr>
+        <w:pStyle w:val="Heading1"/>
+        <w:rPr>
+          <w:b/>
+          <w:sz w:val="52"/>
+          <w:szCs w:val="52"/>
+          <w:u w:val="single"/>
+        </w:rPr>
+      </w:pPr>
+      <w:r>
+        <w:rPr>
+          <w:b/>
+          <w:color w:val="auto"/>
+          <w:sz w:val="52"/>
+          <w:szCs w:val="52"/>
+          <w:u w:val="single"/>
+        </w:rPr>
+        <w:lastRenderedPageBreak/>
+        <w:t xml:space="preserve">WEEK 8 </w:t>
+      </w:r>
+      <w:r>
+        <w:rPr>
+          <w:b/>
+          <w:sz w:val="52"/>
+          <w:szCs w:val="52"/>
+          <w:u w:val="single"/>
+        </w:rPr>
+        <w:br/>
+      </w:r>
+      <w:r>
+        <w:rPr>
+          <w:b/>
+          <w:sz w:val="52"/>
+          <w:szCs w:val="52"/>
+          <w:u w:val="single"/>
+        </w:rPr>
+        <w:br/>
+      </w:r>
+    </w:p>
     <w:sectPr>
       <w:pgSz w:w="12240" w:h="15840"/>
       <w:pgMar w:top="1440" w:right="1440" w:bottom="1440" w:left="1440" w:header="720" w:footer="720" w:gutter="0"/>
@@ -15634,7 +15903,7 @@
 </file>
 
 <file path=customXml/itemProps1.xml><?xml version="1.0" encoding="utf-8"?>
-<ds:datastoreItem xmlns:ds="http://schemas.openxmlformats.org/officeDocument/2006/customXml" ds:itemID="{B90D9C6B-DF33-476E-951B-D1B21B156BC6}">
+<ds:datastoreItem xmlns:ds="http://schemas.openxmlformats.org/officeDocument/2006/customXml" ds:itemID="{48CDB7C8-4AC4-4514-850C-98F2E80843EE}">
   <ds:schemaRefs>
     <ds:schemaRef ds:uri="http://schemas.openxmlformats.org/officeDocument/2006/bibliography"/>
   </ds:schemaRefs>

</xml_diff>